<commit_message>
Integrate Sugar companions and current-source discovery records
</commit_message>
<xml_diff>
--- a/Science_Teesside/Teaching_Packs/BUILD/lessons/W8A/BUILD_Science_Autumn1_W8A_Sugar_Evidence_Read_The_Label_Pupil.docx
+++ b/Science_Teesside/Teaching_Packs/BUILD/lessons/W8A/BUILD_Science_Autumn1_W8A_Sugar_Evidence_Read_The_Label_Pupil.docx
@@ -7,30 +7,15 @@
         <w:pStyle w:val="Title"/>
       </w:pPr>
       <w:r>
-        <w:t>Sugar Evidence: Read the Label</w:t>
-      </w:r>
-    </w:p>
-    <w:p>
-      <w:pPr>
-        <w:pStyle w:val="Subtitle"/>
-      </w:pPr>
-      <w:r>
-        <w:t>BUILD · Science · 40 minutes</w:t>
+        <w:t>Sugar evidence knowledge organiser</w:t>
       </w:r>
     </w:p>
     <w:p>
       <w:r>
-        <w:t>I can compare sugar values using the same label basis and order four supplied food labels from least to most sugar.</w:t>
-      </w:r>
-    </w:p>
-    <w:p>
-      <w:r>
-        <w:t>Name: __________________________    Date: ______________</w:t>
-      </w:r>
-    </w:p>
-    <w:p>
-      <w:r>
-        <w:t>You may write, type, say, sign, point or direct a partner. An adult can read the words and record your exact response. Keep the choice and explanation your own.</w:t>
+        <w:rPr>
+          <w:b w:val="0"/>
+        </w:rPr>
+        <w:t>Read the sugar line and compare equal amounts of food.</w:t>
       </w:r>
     </w:p>
     <w:p>
@@ -38,212 +23,820 @@
         <w:pStyle w:val="Heading2"/>
       </w:pPr>
       <w:r>
-        <w:t>Words for this lesson</w:t>
+        <w:t>Learning objective</w:t>
+      </w:r>
+    </w:p>
+    <w:p>
+      <w:r>
+        <w:rPr>
+          <w:b w:val="0"/>
+        </w:rPr>
+        <w:t>I can compare sugar values using the same label basis and order four supplied food labels from least to most sugar.</w:t>
+      </w:r>
+    </w:p>
+    <w:p>
+      <w:pPr>
+        <w:pStyle w:val="Heading2"/>
+      </w:pPr>
+      <w:r>
+        <w:t>Success criteria</w:t>
+      </w:r>
+    </w:p>
+    <w:p>
+      <w:pPr>
+        <w:pStyle w:val="ListBullet"/>
+      </w:pPr>
+      <w:r>
+        <w:rPr>
+          <w:b w:val="0"/>
+        </w:rPr>
+        <w:t>I can find the sugar number, unit and label basis.</w:t>
+      </w:r>
+    </w:p>
+    <w:p>
+      <w:pPr>
+        <w:pStyle w:val="ListBullet"/>
+      </w:pPr>
+      <w:r>
+        <w:rPr>
+          <w:b w:val="0"/>
+        </w:rPr>
+        <w:t>I can compare values only when the unit and basis match.</w:t>
+      </w:r>
+    </w:p>
+    <w:p>
+      <w:pPr>
+        <w:pStyle w:val="ListBullet"/>
+      </w:pPr>
+      <w:r>
+        <w:rPr>
+          <w:b w:val="0"/>
+        </w:rPr>
+        <w:t>I can order four labels and explain that sugar is one part of nutrition evidence.</w:t>
+      </w:r>
+    </w:p>
+    <w:p>
+      <w:pPr>
+        <w:pStyle w:val="Heading2"/>
+      </w:pPr>
+      <w:r>
+        <w:t>Reading the whole sugar line</w:t>
       </w:r>
     </w:p>
     <w:tbl>
       <w:tblPr>
-        <w:tblW w:type="dxa" w:w="9865"/>
-        <w:jc w:val="center"/>
+        <w:tblW w:type="auto" w:w="0"/>
         <w:tblLayout w:type="fixed"/>
         <w:tblLook w:firstColumn="1" w:firstRow="1" w:lastColumn="0" w:lastRow="0" w:noHBand="0" w:noVBand="1" w:val="04A0"/>
-        <w:tblInd w:w="0" w:type="dxa"/>
-        <w:tblCellMar>
-          <w:top w:w="90" w:type="dxa"/>
-          <w:left w:w="90" w:type="dxa"/>
-          <w:bottom w:w="90" w:type="dxa"/>
-          <w:right w:w="90" w:type="dxa"/>
-        </w:tblCellMar>
+        <w:tblBorders>
+          <w:top w:val="single" w:sz="5" w:color="D9D9D9"/>
+          <w:left w:val="single" w:sz="5" w:color="D9D9D9"/>
+          <w:bottom w:val="single" w:sz="5" w:color="D9D9D9"/>
+          <w:right w:val="single" w:sz="5" w:color="D9D9D9"/>
+          <w:insideH w:val="single" w:sz="5" w:color="D9D9D9"/>
+          <w:insideV w:val="single" w:sz="5" w:color="D9D9D9"/>
+        </w:tblBorders>
       </w:tblPr>
       <w:tblGrid>
-        <w:gridCol w:w="4932"/>
-        <w:gridCol w:w="4932"/>
+        <w:gridCol w:w="5046"/>
+        <w:gridCol w:w="5046"/>
       </w:tblGrid>
       <w:tr>
         <w:trPr>
-          <w:cantSplit/>
           <w:tblHeader/>
         </w:trPr>
         <w:tc>
           <w:tcPr>
-            <w:tcW w:type="dxa" w:w="4932"/>
-            <w:vAlign w:val="top"/>
-            <w:shd w:fill="4E7A9B"/>
+            <w:tcW w:type="dxa" w:w="5046"/>
+            <w:tcMar>
+              <w:top w:w="110" w:type="dxa"/>
+              <w:bottom w:w="110" w:type="dxa"/>
+              <w:left w:w="110" w:type="dxa"/>
+              <w:right w:w="110" w:type="dxa"/>
+            </w:tcMar>
+            <w:shd w:fill="E8EFF4"/>
           </w:tcPr>
           <w:p>
             <w:pPr>
-              <w:spacing w:after="60" w:line="269" w:lineRule="auto"/>
+              <w:spacing w:after="60"/>
             </w:pPr>
             <w:r>
               <w:rPr>
-                <w:rFonts w:ascii="Arial" w:hAnsi="Arial"/>
                 <w:b/>
-                <w:color w:val="FFFFFF"/>
                 <w:sz w:val="22"/>
               </w:rPr>
-              <w:t>Word</w:t>
+              <w:t>Teaching label X</w:t>
             </w:r>
           </w:p>
         </w:tc>
         <w:tc>
           <w:tcPr>
-            <w:tcW w:type="dxa" w:w="4932"/>
-            <w:vAlign w:val="top"/>
-            <w:shd w:fill="4E7A9B"/>
+            <w:tcW w:type="dxa" w:w="5046"/>
+            <w:tcMar>
+              <w:top w:w="110" w:type="dxa"/>
+              <w:bottom w:w="110" w:type="dxa"/>
+              <w:left w:w="110" w:type="dxa"/>
+              <w:right w:w="110" w:type="dxa"/>
+            </w:tcMar>
+            <w:shd w:fill="E8EFF4"/>
           </w:tcPr>
           <w:p>
             <w:pPr>
-              <w:spacing w:after="60" w:line="269" w:lineRule="auto"/>
+              <w:spacing w:after="60"/>
             </w:pPr>
             <w:r>
               <w:rPr>
-                <w:rFonts w:ascii="Arial" w:hAnsi="Arial"/>
                 <w:b/>
-                <w:color w:val="FFFFFF"/>
                 <w:sz w:val="22"/>
               </w:rPr>
-              <w:t>Meaning</w:t>
+              <w:t>Per 100 g</w:t>
             </w:r>
           </w:p>
         </w:tc>
       </w:tr>
       <w:tr>
-        <w:trPr>
-          <w:cantSplit/>
-        </w:trPr>
         <w:tc>
           <w:tcPr>
-            <w:tcW w:type="dxa" w:w="4932"/>
-            <w:vAlign w:val="top"/>
-            <w:shd w:fill="FFFFFF"/>
+            <w:tcW w:type="dxa" w:w="5046"/>
+            <w:tcMar>
+              <w:top w:w="110" w:type="dxa"/>
+              <w:bottom w:w="110" w:type="dxa"/>
+              <w:left w:w="110" w:type="dxa"/>
+              <w:right w:w="110" w:type="dxa"/>
+            </w:tcMar>
           </w:tcPr>
           <w:p>
             <w:pPr>
-              <w:spacing w:after="60" w:line="269" w:lineRule="auto"/>
+              <w:spacing w:after="60"/>
             </w:pPr>
             <w:r>
               <w:rPr>
-                <w:rFonts w:ascii="Arial" w:hAnsi="Arial"/>
                 <w:b w:val="0"/>
-                <w:color w:val="18233F"/>
                 <w:sz w:val="22"/>
               </w:rPr>
-              <w:t>nutrition label</w:t>
+              <w:t>Carbohydrate</w:t>
             </w:r>
           </w:p>
         </w:tc>
         <w:tc>
           <w:tcPr>
-            <w:tcW w:type="dxa" w:w="4932"/>
-            <w:vAlign w:val="top"/>
-            <w:shd w:fill="FFFFFF"/>
+            <w:tcW w:type="dxa" w:w="5046"/>
+            <w:tcMar>
+              <w:top w:w="110" w:type="dxa"/>
+              <w:bottom w:w="110" w:type="dxa"/>
+              <w:left w:w="110" w:type="dxa"/>
+              <w:right w:w="110" w:type="dxa"/>
+            </w:tcMar>
           </w:tcPr>
           <w:p>
             <w:pPr>
-              <w:spacing w:after="60" w:line="269" w:lineRule="auto"/>
+              <w:spacing w:after="60"/>
             </w:pPr>
             <w:r>
               <w:rPr>
-                <w:rFonts w:ascii="Arial" w:hAnsi="Arial"/>
                 <w:b w:val="0"/>
-                <w:color w:val="18233F"/>
                 <w:sz w:val="22"/>
               </w:rPr>
-              <w:t>food information panel</w:t>
+              <w:t>47 g</w:t>
             </w:r>
           </w:p>
         </w:tc>
       </w:tr>
       <w:tr>
+        <w:tc>
+          <w:tcPr>
+            <w:tcW w:type="dxa" w:w="5046"/>
+            <w:tcMar>
+              <w:top w:w="110" w:type="dxa"/>
+              <w:bottom w:w="110" w:type="dxa"/>
+              <w:left w:w="110" w:type="dxa"/>
+              <w:right w:w="110" w:type="dxa"/>
+            </w:tcMar>
+          </w:tcPr>
+          <w:p>
+            <w:pPr>
+              <w:spacing w:after="60"/>
+            </w:pPr>
+            <w:r>
+              <w:rPr>
+                <w:b w:val="0"/>
+                <w:sz w:val="22"/>
+              </w:rPr>
+              <w:t>of which sugars</w:t>
+            </w:r>
+          </w:p>
+        </w:tc>
+        <w:tc>
+          <w:tcPr>
+            <w:tcW w:type="dxa" w:w="5046"/>
+            <w:tcMar>
+              <w:top w:w="110" w:type="dxa"/>
+              <w:bottom w:w="110" w:type="dxa"/>
+              <w:left w:w="110" w:type="dxa"/>
+              <w:right w:w="110" w:type="dxa"/>
+            </w:tcMar>
+          </w:tcPr>
+          <w:p>
+            <w:pPr>
+              <w:spacing w:after="60"/>
+            </w:pPr>
+            <w:r>
+              <w:rPr>
+                <w:b w:val="0"/>
+                <w:sz w:val="22"/>
+              </w:rPr>
+              <w:t>8 g</w:t>
+            </w:r>
+          </w:p>
+        </w:tc>
+      </w:tr>
+    </w:tbl>
+    <w:p>
+      <w:r>
+        <w:rPr>
+          <w:b w:val="0"/>
+        </w:rPr>
+        <w:t>8 is the number. g is the unit (grams measure mass). Per 100 g is the basis: the amount of food compared.</w:t>
+      </w:r>
+    </w:p>
+    <w:p>
+      <w:pPr>
+        <w:pStyle w:val="Heading2"/>
+      </w:pPr>
+      <w:r>
+        <w:t>Useful words</w:t>
+      </w:r>
+    </w:p>
+    <w:p>
+      <w:r>
+        <w:rPr>
+          <w:b w:val="0"/>
+        </w:rPr>
+        <w:t>Carbohydrate: A nutrient group that includes sugars.</w:t>
+      </w:r>
+    </w:p>
+    <w:p>
+      <w:r>
+        <w:rPr>
+          <w:b w:val="0"/>
+        </w:rPr>
+        <w:t>Of which sugars: The sugar part of total carbohydrate.</w:t>
+      </w:r>
+    </w:p>
+    <w:p>
+      <w:r>
+        <w:rPr>
+          <w:b w:val="0"/>
+        </w:rPr>
+        <w:t>Evidence: Information used to support a claim.</w:t>
+      </w:r>
+    </w:p>
+    <w:p>
+      <w:pPr>
+        <w:pStyle w:val="Heading2"/>
+      </w:pPr>
+      <w:r>
+        <w:t>Equal amounts and a fair comparison</w:t>
+      </w:r>
+    </w:p>
+    <w:p>
+      <w:r>
+        <w:rPr>
+          <w:b w:val="0"/>
+        </w:rPr>
+        <w:t>P 6 g, Q 11 g, R 18 g and S 21 g sugar per 100 g: P &lt; Q &lt; R &lt; S.</w:t>
+      </w:r>
+    </w:p>
+    <w:p>
+      <w:r>
+        <w:rPr>
+          <w:b w:val="0"/>
+        </w:rPr>
+        <w:t>Extension: Z has 2 g sugar per 20 g serving. Five servings make 100 g of food, so 5 × 2 g = 10 g sugar per 100 g. The order is P, Z, Q, R, S.</w:t>
+      </w:r>
+    </w:p>
+    <w:p>
+      <w:r>
+        <w:rPr>
+          <w:b w:val="0"/>
+        </w:rPr>
+        <w:t>P has less sugar per 100 g than Q. Sugar alone cannot show which food is healthiest overall. Sugars are already included in the carbohydrate total.</w:t>
+      </w:r>
+    </w:p>
+    <w:p>
+      <w:r>
+        <w:br w:type="page"/>
+      </w:r>
+    </w:p>
+    <w:p>
+      <w:pPr>
+        <w:pStyle w:val="Heading1"/>
+      </w:pPr>
+      <w:r>
+        <w:t>Shared label cards</w:t>
+      </w:r>
+    </w:p>
+    <w:p>
+      <w:r>
+        <w:rPr>
+          <w:b w:val="0"/>
+        </w:rPr>
+        <w:t>Fictional teaching labels. Each A to D label describes 100 g of food. Nothing is tasted.</w:t>
+      </w:r>
+    </w:p>
+    <w:tbl>
+      <w:tblPr>
+        <w:tblW w:type="auto" w:w="0"/>
+        <w:tblLayout w:type="fixed"/>
+        <w:tblLook w:firstColumn="1" w:firstRow="1" w:lastColumn="0" w:lastRow="0" w:noHBand="0" w:noVBand="1" w:val="04A0"/>
+        <w:tblBorders>
+          <w:top w:val="single" w:sz="5" w:color="D9D9D9"/>
+          <w:left w:val="single" w:sz="5" w:color="D9D9D9"/>
+          <w:bottom w:val="single" w:sz="5" w:color="D9D9D9"/>
+          <w:right w:val="single" w:sz="5" w:color="D9D9D9"/>
+          <w:insideH w:val="single" w:sz="5" w:color="D9D9D9"/>
+          <w:insideV w:val="single" w:sz="5" w:color="D9D9D9"/>
+        </w:tblBorders>
+      </w:tblPr>
+      <w:tblGrid>
+        <w:gridCol w:w="2523"/>
+        <w:gridCol w:w="2523"/>
+        <w:gridCol w:w="2523"/>
+        <w:gridCol w:w="2523"/>
+      </w:tblGrid>
+      <w:tr>
         <w:trPr>
-          <w:cantSplit/>
+          <w:tblHeader/>
         </w:trPr>
         <w:tc>
           <w:tcPr>
-            <w:tcW w:type="dxa" w:w="4932"/>
-            <w:vAlign w:val="top"/>
-            <w:shd w:fill="F1F5F6"/>
+            <w:tcW w:type="dxa" w:w="2523"/>
+            <w:tcMar>
+              <w:top w:w="110" w:type="dxa"/>
+              <w:bottom w:w="110" w:type="dxa"/>
+              <w:left w:w="110" w:type="dxa"/>
+              <w:right w:w="110" w:type="dxa"/>
+            </w:tcMar>
+            <w:shd w:fill="E8EFF4"/>
           </w:tcPr>
           <w:p>
             <w:pPr>
-              <w:spacing w:after="60" w:line="269" w:lineRule="auto"/>
+              <w:spacing w:after="60"/>
             </w:pPr>
             <w:r>
               <w:rPr>
-                <w:rFonts w:ascii="Arial" w:hAnsi="Arial"/>
+                <w:b/>
+                <w:sz w:val="22"/>
+              </w:rPr>
+              <w:t>Label</w:t>
+            </w:r>
+          </w:p>
+        </w:tc>
+        <w:tc>
+          <w:tcPr>
+            <w:tcW w:type="dxa" w:w="2523"/>
+            <w:tcMar>
+              <w:top w:w="110" w:type="dxa"/>
+              <w:bottom w:w="110" w:type="dxa"/>
+              <w:left w:w="110" w:type="dxa"/>
+              <w:right w:w="110" w:type="dxa"/>
+            </w:tcMar>
+            <w:shd w:fill="E8EFF4"/>
+          </w:tcPr>
+          <w:p>
+            <w:pPr>
+              <w:spacing w:after="60"/>
+            </w:pPr>
+            <w:r>
+              <w:rPr>
+                <w:b/>
+                <w:sz w:val="22"/>
+              </w:rPr>
+              <w:t>Carbohydrate</w:t>
+            </w:r>
+          </w:p>
+        </w:tc>
+        <w:tc>
+          <w:tcPr>
+            <w:tcW w:type="dxa" w:w="2523"/>
+            <w:tcMar>
+              <w:top w:w="110" w:type="dxa"/>
+              <w:bottom w:w="110" w:type="dxa"/>
+              <w:left w:w="110" w:type="dxa"/>
+              <w:right w:w="110" w:type="dxa"/>
+            </w:tcMar>
+            <w:shd w:fill="E8EFF4"/>
+          </w:tcPr>
+          <w:p>
+            <w:pPr>
+              <w:spacing w:after="60"/>
+            </w:pPr>
+            <w:r>
+              <w:rPr>
+                <w:b/>
+                <w:sz w:val="22"/>
+              </w:rPr>
+              <w:t>Of which sugars</w:t>
+            </w:r>
+          </w:p>
+        </w:tc>
+        <w:tc>
+          <w:tcPr>
+            <w:tcW w:type="dxa" w:w="2523"/>
+            <w:tcMar>
+              <w:top w:w="110" w:type="dxa"/>
+              <w:bottom w:w="110" w:type="dxa"/>
+              <w:left w:w="110" w:type="dxa"/>
+              <w:right w:w="110" w:type="dxa"/>
+            </w:tcMar>
+            <w:shd w:fill="E8EFF4"/>
+          </w:tcPr>
+          <w:p>
+            <w:pPr>
+              <w:spacing w:after="60"/>
+            </w:pPr>
+            <w:r>
+              <w:rPr>
+                <w:b/>
+                <w:sz w:val="22"/>
+              </w:rPr>
+              <w:t>Basis</w:t>
+            </w:r>
+          </w:p>
+        </w:tc>
+      </w:tr>
+      <w:tr>
+        <w:tc>
+          <w:tcPr>
+            <w:tcW w:type="dxa" w:w="2523"/>
+            <w:tcMar>
+              <w:top w:w="110" w:type="dxa"/>
+              <w:bottom w:w="110" w:type="dxa"/>
+              <w:left w:w="110" w:type="dxa"/>
+              <w:right w:w="110" w:type="dxa"/>
+            </w:tcMar>
+          </w:tcPr>
+          <w:p>
+            <w:pPr>
+              <w:spacing w:after="60"/>
+            </w:pPr>
+            <w:r>
+              <w:rPr>
                 <w:b w:val="0"/>
-                <w:color w:val="18233F"/>
+                <w:sz w:val="22"/>
+              </w:rPr>
+              <w:t>A</w:t>
+            </w:r>
+          </w:p>
+        </w:tc>
+        <w:tc>
+          <w:tcPr>
+            <w:tcW w:type="dxa" w:w="2523"/>
+            <w:tcMar>
+              <w:top w:w="110" w:type="dxa"/>
+              <w:bottom w:w="110" w:type="dxa"/>
+              <w:left w:w="110" w:type="dxa"/>
+              <w:right w:w="110" w:type="dxa"/>
+            </w:tcMar>
+          </w:tcPr>
+          <w:p>
+            <w:pPr>
+              <w:spacing w:after="60"/>
+            </w:pPr>
+            <w:r>
+              <w:rPr>
+                <w:b w:val="0"/>
+                <w:sz w:val="22"/>
+              </w:rPr>
+              <w:t>22 g</w:t>
+            </w:r>
+          </w:p>
+        </w:tc>
+        <w:tc>
+          <w:tcPr>
+            <w:tcW w:type="dxa" w:w="2523"/>
+            <w:tcMar>
+              <w:top w:w="110" w:type="dxa"/>
+              <w:bottom w:w="110" w:type="dxa"/>
+              <w:left w:w="110" w:type="dxa"/>
+              <w:right w:w="110" w:type="dxa"/>
+            </w:tcMar>
+          </w:tcPr>
+          <w:p>
+            <w:pPr>
+              <w:spacing w:after="60"/>
+            </w:pPr>
+            <w:r>
+              <w:rPr>
+                <w:b w:val="0"/>
+                <w:sz w:val="22"/>
+              </w:rPr>
+              <w:t>4 g</w:t>
+            </w:r>
+          </w:p>
+        </w:tc>
+        <w:tc>
+          <w:tcPr>
+            <w:tcW w:type="dxa" w:w="2523"/>
+            <w:tcMar>
+              <w:top w:w="110" w:type="dxa"/>
+              <w:bottom w:w="110" w:type="dxa"/>
+              <w:left w:w="110" w:type="dxa"/>
+              <w:right w:w="110" w:type="dxa"/>
+            </w:tcMar>
+          </w:tcPr>
+          <w:p>
+            <w:pPr>
+              <w:spacing w:after="60"/>
+            </w:pPr>
+            <w:r>
+              <w:rPr>
+                <w:b w:val="0"/>
                 <w:sz w:val="22"/>
               </w:rPr>
               <w:t>per 100 g</w:t>
             </w:r>
           </w:p>
         </w:tc>
+      </w:tr>
+      <w:tr>
         <w:tc>
           <w:tcPr>
-            <w:tcW w:type="dxa" w:w="4932"/>
-            <w:vAlign w:val="top"/>
-            <w:shd w:fill="F1F5F6"/>
+            <w:tcW w:type="dxa" w:w="2523"/>
+            <w:tcMar>
+              <w:top w:w="110" w:type="dxa"/>
+              <w:bottom w:w="110" w:type="dxa"/>
+              <w:left w:w="110" w:type="dxa"/>
+              <w:right w:w="110" w:type="dxa"/>
+            </w:tcMar>
           </w:tcPr>
           <w:p>
             <w:pPr>
-              <w:spacing w:after="60" w:line="269" w:lineRule="auto"/>
+              <w:spacing w:after="60"/>
             </w:pPr>
             <w:r>
               <w:rPr>
-                <w:rFonts w:ascii="Arial" w:hAnsi="Arial"/>
                 <w:b w:val="0"/>
-                <w:color w:val="18233F"/>
                 <w:sz w:val="22"/>
               </w:rPr>
-              <w:t>in the same 100 g amount</w:t>
+              <w:t>B</w:t>
+            </w:r>
+          </w:p>
+        </w:tc>
+        <w:tc>
+          <w:tcPr>
+            <w:tcW w:type="dxa" w:w="2523"/>
+            <w:tcMar>
+              <w:top w:w="110" w:type="dxa"/>
+              <w:bottom w:w="110" w:type="dxa"/>
+              <w:left w:w="110" w:type="dxa"/>
+              <w:right w:w="110" w:type="dxa"/>
+            </w:tcMar>
+          </w:tcPr>
+          <w:p>
+            <w:pPr>
+              <w:spacing w:after="60"/>
+            </w:pPr>
+            <w:r>
+              <w:rPr>
+                <w:b w:val="0"/>
+                <w:sz w:val="22"/>
+              </w:rPr>
+              <w:t>67 g</w:t>
+            </w:r>
+          </w:p>
+        </w:tc>
+        <w:tc>
+          <w:tcPr>
+            <w:tcW w:type="dxa" w:w="2523"/>
+            <w:tcMar>
+              <w:top w:w="110" w:type="dxa"/>
+              <w:bottom w:w="110" w:type="dxa"/>
+              <w:left w:w="110" w:type="dxa"/>
+              <w:right w:w="110" w:type="dxa"/>
+            </w:tcMar>
+          </w:tcPr>
+          <w:p>
+            <w:pPr>
+              <w:spacing w:after="60"/>
+            </w:pPr>
+            <w:r>
+              <w:rPr>
+                <w:b w:val="0"/>
+                <w:sz w:val="22"/>
+              </w:rPr>
+              <w:t>9 g</w:t>
+            </w:r>
+          </w:p>
+        </w:tc>
+        <w:tc>
+          <w:tcPr>
+            <w:tcW w:type="dxa" w:w="2523"/>
+            <w:tcMar>
+              <w:top w:w="110" w:type="dxa"/>
+              <w:bottom w:w="110" w:type="dxa"/>
+              <w:left w:w="110" w:type="dxa"/>
+              <w:right w:w="110" w:type="dxa"/>
+            </w:tcMar>
+          </w:tcPr>
+          <w:p>
+            <w:pPr>
+              <w:spacing w:after="60"/>
+            </w:pPr>
+            <w:r>
+              <w:rPr>
+                <w:b w:val="0"/>
+                <w:sz w:val="22"/>
+              </w:rPr>
+              <w:t>per 100 g</w:t>
             </w:r>
           </w:p>
         </w:tc>
       </w:tr>
       <w:tr>
-        <w:trPr>
-          <w:cantSplit/>
-        </w:trPr>
         <w:tc>
           <w:tcPr>
-            <w:tcW w:type="dxa" w:w="4932"/>
-            <w:vAlign w:val="top"/>
-            <w:shd w:fill="FFFFFF"/>
+            <w:tcW w:type="dxa" w:w="2523"/>
+            <w:tcMar>
+              <w:top w:w="110" w:type="dxa"/>
+              <w:bottom w:w="110" w:type="dxa"/>
+              <w:left w:w="110" w:type="dxa"/>
+              <w:right w:w="110" w:type="dxa"/>
+            </w:tcMar>
           </w:tcPr>
           <w:p>
             <w:pPr>
-              <w:spacing w:after="60" w:line="269" w:lineRule="auto"/>
+              <w:spacing w:after="60"/>
             </w:pPr>
             <w:r>
               <w:rPr>
-                <w:rFonts w:ascii="Arial" w:hAnsi="Arial"/>
                 <w:b w:val="0"/>
-                <w:color w:val="18233F"/>
                 <w:sz w:val="22"/>
               </w:rPr>
-              <w:t>evidence</w:t>
+              <w:t>C</w:t>
             </w:r>
           </w:p>
         </w:tc>
         <w:tc>
           <w:tcPr>
-            <w:tcW w:type="dxa" w:w="4932"/>
-            <w:vAlign w:val="top"/>
-            <w:shd w:fill="FFFFFF"/>
+            <w:tcW w:type="dxa" w:w="2523"/>
+            <w:tcMar>
+              <w:top w:w="110" w:type="dxa"/>
+              <w:bottom w:w="110" w:type="dxa"/>
+              <w:left w:w="110" w:type="dxa"/>
+              <w:right w:w="110" w:type="dxa"/>
+            </w:tcMar>
           </w:tcPr>
           <w:p>
             <w:pPr>
-              <w:spacing w:after="60" w:line="269" w:lineRule="auto"/>
+              <w:spacing w:after="60"/>
             </w:pPr>
             <w:r>
               <w:rPr>
-                <w:rFonts w:ascii="Arial" w:hAnsi="Arial"/>
                 <w:b w:val="0"/>
-                <w:color w:val="18233F"/>
                 <w:sz w:val="22"/>
               </w:rPr>
-              <w:t>the number we read</w:t>
+              <w:t>58 g</w:t>
+            </w:r>
+          </w:p>
+        </w:tc>
+        <w:tc>
+          <w:tcPr>
+            <w:tcW w:type="dxa" w:w="2523"/>
+            <w:tcMar>
+              <w:top w:w="110" w:type="dxa"/>
+              <w:bottom w:w="110" w:type="dxa"/>
+              <w:left w:w="110" w:type="dxa"/>
+              <w:right w:w="110" w:type="dxa"/>
+            </w:tcMar>
+          </w:tcPr>
+          <w:p>
+            <w:pPr>
+              <w:spacing w:after="60"/>
+            </w:pPr>
+            <w:r>
+              <w:rPr>
+                <w:b w:val="0"/>
+                <w:sz w:val="22"/>
+              </w:rPr>
+              <w:t>14 g</w:t>
+            </w:r>
+          </w:p>
+        </w:tc>
+        <w:tc>
+          <w:tcPr>
+            <w:tcW w:type="dxa" w:w="2523"/>
+            <w:tcMar>
+              <w:top w:w="110" w:type="dxa"/>
+              <w:bottom w:w="110" w:type="dxa"/>
+              <w:left w:w="110" w:type="dxa"/>
+              <w:right w:w="110" w:type="dxa"/>
+            </w:tcMar>
+          </w:tcPr>
+          <w:p>
+            <w:pPr>
+              <w:spacing w:after="60"/>
+            </w:pPr>
+            <w:r>
+              <w:rPr>
+                <w:b w:val="0"/>
+                <w:sz w:val="22"/>
+              </w:rPr>
+              <w:t>per 100 g</w:t>
+            </w:r>
+          </w:p>
+        </w:tc>
+      </w:tr>
+      <w:tr>
+        <w:tc>
+          <w:tcPr>
+            <w:tcW w:type="dxa" w:w="2523"/>
+            <w:tcMar>
+              <w:top w:w="110" w:type="dxa"/>
+              <w:bottom w:w="110" w:type="dxa"/>
+              <w:left w:w="110" w:type="dxa"/>
+              <w:right w:w="110" w:type="dxa"/>
+            </w:tcMar>
+          </w:tcPr>
+          <w:p>
+            <w:pPr>
+              <w:spacing w:after="60"/>
+            </w:pPr>
+            <w:r>
+              <w:rPr>
+                <w:b w:val="0"/>
+                <w:sz w:val="22"/>
+              </w:rPr>
+              <w:t>D</w:t>
+            </w:r>
+          </w:p>
+        </w:tc>
+        <w:tc>
+          <w:tcPr>
+            <w:tcW w:type="dxa" w:w="2523"/>
+            <w:tcMar>
+              <w:top w:w="110" w:type="dxa"/>
+              <w:bottom w:w="110" w:type="dxa"/>
+              <w:left w:w="110" w:type="dxa"/>
+              <w:right w:w="110" w:type="dxa"/>
+            </w:tcMar>
+          </w:tcPr>
+          <w:p>
+            <w:pPr>
+              <w:spacing w:after="60"/>
+            </w:pPr>
+            <w:r>
+              <w:rPr>
+                <w:b w:val="0"/>
+                <w:sz w:val="22"/>
+              </w:rPr>
+              <w:t>72 g</w:t>
+            </w:r>
+          </w:p>
+        </w:tc>
+        <w:tc>
+          <w:tcPr>
+            <w:tcW w:type="dxa" w:w="2523"/>
+            <w:tcMar>
+              <w:top w:w="110" w:type="dxa"/>
+              <w:bottom w:w="110" w:type="dxa"/>
+              <w:left w:w="110" w:type="dxa"/>
+              <w:right w:w="110" w:type="dxa"/>
+            </w:tcMar>
+          </w:tcPr>
+          <w:p>
+            <w:pPr>
+              <w:spacing w:after="60"/>
+            </w:pPr>
+            <w:r>
+              <w:rPr>
+                <w:b w:val="0"/>
+                <w:sz w:val="22"/>
+              </w:rPr>
+              <w:t>23 g</w:t>
+            </w:r>
+          </w:p>
+        </w:tc>
+        <w:tc>
+          <w:tcPr>
+            <w:tcW w:type="dxa" w:w="2523"/>
+            <w:tcMar>
+              <w:top w:w="110" w:type="dxa"/>
+              <w:bottom w:w="110" w:type="dxa"/>
+              <w:left w:w="110" w:type="dxa"/>
+              <w:right w:w="110" w:type="dxa"/>
+            </w:tcMar>
+          </w:tcPr>
+          <w:p>
+            <w:pPr>
+              <w:spacing w:after="60"/>
+            </w:pPr>
+            <w:r>
+              <w:rPr>
+                <w:b w:val="0"/>
+                <w:sz w:val="22"/>
+              </w:rPr>
+              <w:t>per 100 g</w:t>
             </w:r>
           </w:p>
         </w:tc>
@@ -251,189 +844,18 @@
     </w:tbl>
     <w:p>
       <w:pPr>
-        <w:spacing w:after="0"/>
-      </w:pPr>
-    </w:p>
-    <w:p>
-      <w:pPr>
         <w:pStyle w:val="Heading2"/>
       </w:pPr>
       <w:r>
-        <w:t>First idea</w:t>
+        <w:t>Challenge card E</w:t>
       </w:r>
     </w:p>
     <w:p>
       <w:r>
-        <w:t>Label A says 6 g sugar per 100 g. Label B says 9 g sugar per 100 g. Which first claim can the evidence support?</w:t>
-      </w:r>
-    </w:p>
-    <w:p>
-      <w:r>
-        <w:t>A. Label A has less sugar per 100 g than Label B.</w:t>
-      </w:r>
-    </w:p>
-    <w:p>
-      <w:r>
-        <w:t>B. Label A is the healthiest food in every way.</w:t>
-      </w:r>
-    </w:p>
-    <w:p>
-      <w:r>
-        <w:t>C. The values cannot be compared because every number on a label means something different.</w:t>
-      </w:r>
-    </w:p>
-    <w:p>
-      <w:pPr>
-        <w:keepNext/>
-      </w:pPr>
-      <w:r>
-        <w:t>My first idea and reason:</w:t>
-      </w:r>
-    </w:p>
-    <w:p>
-      <w:pPr>
-        <w:keepNext/>
-        <w:spacing w:after="0" w:line="240" w:lineRule="auto"/>
-        <w:pBdr>
-          <w:bottom w:val="single" w:sz="3" w:color="D6DFE4" w:space="1"/>
-        </w:pBdr>
-      </w:pPr>
-      <w:r>
         <w:rPr>
-          <w:sz w:val="40"/>
+          <w:b w:val="0"/>
         </w:rPr>
-        <w:t xml:space="preserve"> </w:t>
-      </w:r>
-    </w:p>
-    <w:p>
-      <w:pPr>
-        <w:keepNext w:val="0"/>
-        <w:spacing w:after="0" w:line="240" w:lineRule="auto"/>
-        <w:pBdr>
-          <w:bottom w:val="single" w:sz="3" w:color="D6DFE4" w:space="1"/>
-        </w:pBdr>
-      </w:pPr>
-      <w:r>
-        <w:rPr>
-          <w:sz w:val="40"/>
-        </w:rPr>
-        <w:t xml:space="preserve"> </w:t>
-      </w:r>
-    </w:p>
-    <w:p>
-      <w:pPr>
-        <w:keepNext/>
-        <w:jc w:val="center"/>
-      </w:pPr>
-      <w:r>
-        <w:drawing>
-          <wp:inline xmlns:a="http://schemas.openxmlformats.org/drawingml/2006/main" xmlns:pic="http://schemas.openxmlformats.org/drawingml/2006/picture">
-            <wp:extent cx="2438400" cy="2194560"/>
-            <wp:docPr id="1" name="Picture 1"/>
-            <wp:cNvGraphicFramePr>
-              <a:graphicFrameLocks noChangeAspect="1"/>
-            </wp:cNvGraphicFramePr>
-            <a:graphic>
-              <a:graphicData uri="http://schemas.openxmlformats.org/drawingml/2006/picture">
-                <pic:pic>
-                  <pic:nvPicPr>
-                    <pic:cNvPr id="0" name="3e310a6d53e243d71f60.png"/>
-                    <pic:cNvPicPr/>
-                  </pic:nvPicPr>
-                  <pic:blipFill>
-                    <a:blip r:embed="rId11"/>
-                    <a:stretch>
-                      <a:fillRect/>
-                    </a:stretch>
-                  </pic:blipFill>
-                  <pic:spPr>
-                    <a:xfrm>
-                      <a:off x="0" y="0"/>
-                      <a:ext cx="2438400" cy="2194560"/>
-                    </a:xfrm>
-                    <a:prstGeom prst="rect"/>
-                  </pic:spPr>
-                </pic:pic>
-              </a:graphicData>
-            </a:graphic>
-          </wp:inline>
-        </w:drawing>
-      </w:r>
-    </w:p>
-    <w:p>
-      <w:pPr>
-        <w:pStyle w:val="Caption"/>
-        <w:keepNext w:val="0"/>
-      </w:pPr>
-      <w:r>
-        <w:t>Nutrition label A with the of-which-sugars line highlighted: 6 g per 100 g</w:t>
-      </w:r>
-    </w:p>
-    <w:p>
-      <w:pPr>
-        <w:pStyle w:val="Heading1"/>
-        <w:pageBreakBefore/>
-      </w:pPr>
-      <w:r>
-        <w:t>We do · choose, explain, check</w:t>
-      </w:r>
-    </w:p>
-    <w:p>
-      <w:r>
-        <w:t>Which comparison is fair using the supplied cards?</w:t>
-      </w:r>
-    </w:p>
-    <w:p>
-      <w:r>
-        <w:t>A. Compare 4 g per 100 g with 11 g per 100 g.</w:t>
-      </w:r>
-    </w:p>
-    <w:p>
-      <w:r>
-        <w:t>B. Compare 4 g per 100 g with 3 g per serving without converting.</w:t>
-      </w:r>
-    </w:p>
-    <w:p>
-      <w:r>
-        <w:t>C. Choose the packet with the picture we like best.</w:t>
-      </w:r>
-    </w:p>
-    <w:p>
-      <w:pPr>
-        <w:keepNext/>
-      </w:pPr>
-      <w:r>
-        <w:t>My choice: ______    Evidence or reason:</w:t>
-      </w:r>
-    </w:p>
-    <w:p>
-      <w:pPr>
-        <w:keepNext/>
-        <w:spacing w:after="0" w:line="240" w:lineRule="auto"/>
-        <w:pBdr>
-          <w:bottom w:val="single" w:sz="3" w:color="D6DFE4" w:space="1"/>
-        </w:pBdr>
-      </w:pPr>
-      <w:r>
-        <w:rPr>
-          <w:sz w:val="40"/>
-        </w:rPr>
-        <w:t xml:space="preserve"> </w:t>
-      </w:r>
-    </w:p>
-    <w:p>
-      <w:pPr>
-        <w:keepNext w:val="0"/>
-        <w:spacing w:after="0" w:line="240" w:lineRule="auto"/>
-        <w:pBdr>
-          <w:bottom w:val="single" w:sz="3" w:color="D6DFE4" w:space="1"/>
-        </w:pBdr>
-      </w:pPr>
-      <w:r>
-        <w:rPr>
-          <w:sz w:val="40"/>
-        </w:rPr>
-        <w:t xml:space="preserve"> </w:t>
+        <w:t>Of which sugars: 3 g per 25 g serving. Four such servings weigh 100 g. All other information is unknown.</w:t>
       </w:r>
     </w:p>
     <w:p>
@@ -441,1369 +863,1910 @@
         <w:pStyle w:val="Heading2"/>
       </w:pPr>
       <w:r>
-        <w:t>Same-Basis Sugar Label Lab</w:t>
+        <w:t>Our shared work</w:t>
       </w:r>
     </w:p>
     <w:p>
       <w:r>
-        <w:t>Read each supplied card, place the four values in order, then place the method and limitation cards.</w:t>
+        <w:rPr>
+          <w:b w:val="0"/>
+        </w:rPr>
+        <w:t>Cut out the label rows or point and direct an adult. Arrange A to D from least to most sugar per 100 g. Explain the order before checking.</w:t>
       </w:r>
     </w:p>
     <w:p>
       <w:r>
-        <w:t>Read or hear one card. Choose a group. Give the evidence. A partner checks your reason before you move on. Point or write card numbers; cutting is optional.</w:t>
+        <w:rPr>
+          <w:b w:val="0"/>
+        </w:rPr>
+        <w:t>___________________________________________________________________</w:t>
+      </w:r>
+    </w:p>
+    <w:p>
+      <w:r>
+        <w:rPr>
+          <w:b w:val="0"/>
+        </w:rPr>
+        <w:t>___________________________________________________________________</w:t>
+      </w:r>
+    </w:p>
+    <w:p>
+      <w:r>
+        <w:rPr>
+          <w:b w:val="0"/>
+        </w:rPr>
+        <w:t>___________________________________________________________________</w:t>
+      </w:r>
+    </w:p>
+    <w:p>
+      <w:r>
+        <w:rPr>
+          <w:b w:val="0"/>
+        </w:rPr>
+        <w:t>On label C, box the number, circle the unit and underline the basis:</w:t>
+      </w:r>
+    </w:p>
+    <w:p>
+      <w:r>
+        <w:rPr>
+          <w:b/>
+        </w:rPr>
+        <w:t>Of which sugars     14     g     per 100 g</w:t>
+      </w:r>
+    </w:p>
+    <w:p>
+      <w:r>
+        <w:rPr>
+          <w:b w:val="0"/>
+        </w:rPr>
+        <w:t>Which claim fits the evidence? Circle or say your choice.</w:t>
+      </w:r>
+    </w:p>
+    <w:p>
+      <w:r>
+        <w:rPr>
+          <w:b w:val="0"/>
+        </w:rPr>
+        <w:t>A has less sugar per 100 g than D.     /     A is the healthiest food for everyone.</w:t>
+      </w:r>
+    </w:p>
+    <w:p>
+      <w:r>
+        <w:br w:type="page"/>
+      </w:r>
+    </w:p>
+    <w:p>
+      <w:pPr>
+        <w:pStyle w:val="Heading1"/>
+      </w:pPr>
+      <w:r>
+        <w:t>Arrival task Supported</w:t>
+      </w:r>
+    </w:p>
+    <w:p>
+      <w:r>
+        <w:rPr>
+          <w:b w:val="0"/>
+        </w:rPr>
+        <w:t>Choose the route that helps you show your thinking. Say, point, sign, draw or write. An adult may read the words. These clues also help if this is new.</w:t>
       </w:r>
     </w:p>
     <w:tbl>
       <w:tblPr>
-        <w:tblW w:type="dxa" w:w="9865"/>
-        <w:jc w:val="center"/>
-        <w:tblLayout w:type="fixed"/>
+        <w:tblW w:type="auto" w:w="0"/>
         <w:tblLook w:firstColumn="1" w:firstRow="1" w:lastColumn="0" w:lastRow="0" w:noHBand="0" w:noVBand="1" w:val="04A0"/>
-        <w:tblInd w:w="0" w:type="dxa"/>
-        <w:tblCellMar>
-          <w:top w:w="90" w:type="dxa"/>
-          <w:left w:w="90" w:type="dxa"/>
-          <w:bottom w:w="90" w:type="dxa"/>
-          <w:right w:w="90" w:type="dxa"/>
-        </w:tblCellMar>
       </w:tblPr>
       <w:tblGrid>
-        <w:gridCol w:w="4932"/>
-        <w:gridCol w:w="4932"/>
+        <w:gridCol w:w="5046"/>
+        <w:gridCol w:w="5046"/>
       </w:tblGrid>
       <w:tr>
-        <w:trPr>
-          <w:cantSplit/>
-          <w:tblHeader/>
-        </w:trPr>
         <w:tc>
           <w:tcPr>
-            <w:tcW w:type="dxa" w:w="4932"/>
-            <w:vAlign w:val="top"/>
-            <w:shd w:fill="4E7A9B"/>
+            <w:tcW w:type="dxa" w:w="5046"/>
           </w:tcPr>
           <w:p>
             <w:pPr>
-              <w:spacing w:after="60" w:line="269" w:lineRule="auto"/>
+              <w:spacing w:after="160"/>
             </w:pPr>
             <w:r>
               <w:rPr>
-                <w:rFonts w:ascii="Arial" w:hAnsi="Arial"/>
                 <w:b/>
-                <w:color w:val="FFFFFF"/>
-                <w:sz w:val="22"/>
               </w:rPr>
-              <w:t>Group</w:t>
+              <w:t>1. Food chain</w:t>
+            </w:r>
+          </w:p>
+          <w:p>
+            <w:pPr>
+              <w:spacing w:after="160"/>
+            </w:pPr>
+            <w:r>
+              <w:t>Plant → caterpillar → bird. Which is the plant that starts this chain?</w:t>
+            </w:r>
+          </w:p>
+          <w:p>
+            <w:pPr>
+              <w:spacing w:after="160"/>
+            </w:pPr>
+            <w:r>
+              <w:rPr>
+                <w:i/>
+                <w:sz w:val="20"/>
+              </w:rPr>
+              <w:t>A producer makes its own food. Here, it is the plant.</w:t>
+            </w:r>
+          </w:p>
+          <w:p>
+            <w:pPr>
+              <w:spacing w:after="160"/>
+            </w:pPr>
+            <w:r>
+              <w:br/>
+              <w:t>____________________________</w:t>
+              <w:br/>
+              <w:br/>
+              <w:t>____________________________</w:t>
+              <w:br/>
             </w:r>
           </w:p>
         </w:tc>
         <w:tc>
           <w:tcPr>
-            <w:tcW w:type="dxa" w:w="4932"/>
-            <w:vAlign w:val="top"/>
-            <w:shd w:fill="4E7A9B"/>
+            <w:tcW w:type="dxa" w:w="5046"/>
           </w:tcPr>
           <w:p>
             <w:pPr>
-              <w:spacing w:after="60" w:line="269" w:lineRule="auto"/>
+              <w:spacing w:after="160"/>
             </w:pPr>
             <w:r>
               <w:rPr>
-                <w:rFonts w:ascii="Arial" w:hAnsi="Arial"/>
                 <w:b/>
-                <w:color w:val="FFFFFF"/>
-                <w:sz w:val="22"/>
               </w:rPr>
-              <w:t>Card numbers and evidence</w:t>
+              <w:t>2. Body jobs</w:t>
+            </w:r>
+          </w:p>
+          <w:p>
+            <w:pPr>
+              <w:spacing w:after="160"/>
+            </w:pPr>
+            <w:r>
+              <w:t>Food helps us have energy and grow. Choose: energy only / growth only / both.</w:t>
+            </w:r>
+          </w:p>
+          <w:p>
+            <w:pPr>
+              <w:spacing w:after="160"/>
+            </w:pPr>
+            <w:r>
+              <w:rPr>
+                <w:i/>
+                <w:sz w:val="20"/>
+              </w:rPr>
+              <w:t>There are two jobs in the question.</w:t>
+            </w:r>
+          </w:p>
+          <w:p>
+            <w:pPr>
+              <w:spacing w:after="160"/>
+            </w:pPr>
+            <w:r>
+              <w:br/>
+              <w:t>____________________________</w:t>
+              <w:br/>
+              <w:br/>
+              <w:t>____________________________</w:t>
+              <w:br/>
             </w:r>
           </w:p>
         </w:tc>
       </w:tr>
       <w:tr>
-        <w:trPr>
-          <w:cantSplit/>
-          <w:trHeight w:val="737"/>
-        </w:trPr>
         <w:tc>
           <w:tcPr>
-            <w:tcW w:type="dxa" w:w="4932"/>
-            <w:vAlign w:val="top"/>
-            <w:shd w:fill="FFFFFF"/>
+            <w:tcW w:type="dxa" w:w="5046"/>
           </w:tcPr>
           <w:p>
             <w:pPr>
-              <w:spacing w:after="60" w:line="269" w:lineRule="auto"/>
+              <w:spacing w:after="160"/>
             </w:pPr>
             <w:r>
               <w:rPr>
-                <w:rFonts w:ascii="Arial" w:hAnsi="Arial"/>
-                <w:b w:val="0"/>
-                <w:color w:val="18233F"/>
-                <w:sz w:val="22"/>
+                <w:b/>
               </w:rPr>
-              <w:t>1 · LEAST SUGAR PER 100 g</w:t>
+              <w:t>3. A varied pattern</w:t>
+            </w:r>
+          </w:p>
+          <w:p>
+            <w:pPr>
+              <w:spacing w:after="160"/>
+            </w:pPr>
+            <w:r>
+              <w:t>A balanced eating pattern includes a range of foods. Choose: one food always / a range of foods.</w:t>
+            </w:r>
+          </w:p>
+          <w:p>
+            <w:pPr>
+              <w:spacing w:after="160"/>
+            </w:pPr>
+            <w:r>
+              <w:rPr>
+                <w:i/>
+                <w:sz w:val="20"/>
+              </w:rPr>
+              <w:t>Balanced means varied over time.</w:t>
+            </w:r>
+          </w:p>
+          <w:p>
+            <w:pPr>
+              <w:spacing w:after="160"/>
+            </w:pPr>
+            <w:r>
+              <w:br/>
+              <w:t>____________________________</w:t>
+              <w:br/>
+              <w:br/>
+              <w:t>____________________________</w:t>
+              <w:br/>
             </w:r>
           </w:p>
         </w:tc>
         <w:tc>
           <w:tcPr>
-            <w:tcW w:type="dxa" w:w="4932"/>
-            <w:vAlign w:val="top"/>
-            <w:shd w:fill="FFFFFF"/>
+            <w:tcW w:type="dxa" w:w="5046"/>
           </w:tcPr>
           <w:p>
             <w:pPr>
-              <w:spacing w:after="60" w:line="269" w:lineRule="auto"/>
+              <w:spacing w:after="160"/>
             </w:pPr>
             <w:r>
               <w:rPr>
-                <w:rFonts w:ascii="Arial" w:hAnsi="Arial"/>
-                <w:b w:val="0"/>
-                <w:color w:val="18233F"/>
-                <w:sz w:val="22"/>
+                <w:b/>
               </w:rPr>
+              <w:t>4. Label clue</w:t>
             </w:r>
           </w:p>
-        </w:tc>
-      </w:tr>
-      <w:tr>
-        <w:trPr>
-          <w:cantSplit/>
-          <w:trHeight w:val="737"/>
-        </w:trPr>
-        <w:tc>
-          <w:tcPr>
-            <w:tcW w:type="dxa" w:w="4932"/>
-            <w:vAlign w:val="top"/>
-            <w:shd w:fill="F1F5F6"/>
-          </w:tcPr>
           <w:p>
             <w:pPr>
-              <w:spacing w:after="60" w:line="269" w:lineRule="auto"/>
+              <w:spacing w:after="160"/>
+            </w:pPr>
+            <w:r>
+              <w:t>Teaching label: 'of which sugars: 4 g per 100 g'. Point to the sugar number.</w:t>
+            </w:r>
+          </w:p>
+          <w:p>
+            <w:pPr>
+              <w:spacing w:after="160"/>
             </w:pPr>
             <w:r>
               <w:rPr>
-                <w:rFonts w:ascii="Arial" w:hAnsi="Arial"/>
-                <w:b w:val="0"/>
-                <w:color w:val="18233F"/>
-                <w:sz w:val="22"/>
+                <w:i/>
+                <w:sz w:val="20"/>
               </w:rPr>
-              <w:t>2 · NEXT VALUE</w:t>
+              <w:t>Find the number just before the first g.</w:t>
             </w:r>
           </w:p>
-        </w:tc>
-        <w:tc>
-          <w:tcPr>
-            <w:tcW w:type="dxa" w:w="4932"/>
-            <w:vAlign w:val="top"/>
-            <w:shd w:fill="F1F5F6"/>
-          </w:tcPr>
           <w:p>
             <w:pPr>
-              <w:spacing w:after="60" w:line="269" w:lineRule="auto"/>
+              <w:spacing w:after="160"/>
             </w:pPr>
             <w:r>
-              <w:rPr>
-                <w:rFonts w:ascii="Arial" w:hAnsi="Arial"/>
-                <w:b w:val="0"/>
-                <w:color w:val="18233F"/>
-                <w:sz w:val="22"/>
-              </w:rPr>
-            </w:r>
-          </w:p>
-        </w:tc>
-      </w:tr>
-      <w:tr>
-        <w:trPr>
-          <w:cantSplit/>
-          <w:trHeight w:val="737"/>
-        </w:trPr>
-        <w:tc>
-          <w:tcPr>
-            <w:tcW w:type="dxa" w:w="4932"/>
-            <w:vAlign w:val="top"/>
-            <w:shd w:fill="FFFFFF"/>
-          </w:tcPr>
-          <w:p>
-            <w:pPr>
-              <w:spacing w:after="60" w:line="269" w:lineRule="auto"/>
-            </w:pPr>
-            <w:r>
-              <w:rPr>
-                <w:rFonts w:ascii="Arial" w:hAnsi="Arial"/>
-                <w:b w:val="0"/>
-                <w:color w:val="18233F"/>
-                <w:sz w:val="22"/>
-              </w:rPr>
-              <w:t>3 · NEXT VALUE</w:t>
-            </w:r>
-          </w:p>
-        </w:tc>
-        <w:tc>
-          <w:tcPr>
-            <w:tcW w:type="dxa" w:w="4932"/>
-            <w:vAlign w:val="top"/>
-            <w:shd w:fill="FFFFFF"/>
-          </w:tcPr>
-          <w:p>
-            <w:pPr>
-              <w:spacing w:after="60" w:line="269" w:lineRule="auto"/>
-            </w:pPr>
-            <w:r>
-              <w:rPr>
-                <w:rFonts w:ascii="Arial" w:hAnsi="Arial"/>
-                <w:b w:val="0"/>
-                <w:color w:val="18233F"/>
-                <w:sz w:val="22"/>
-              </w:rPr>
-            </w:r>
-          </w:p>
-        </w:tc>
-      </w:tr>
-      <w:tr>
-        <w:trPr>
-          <w:cantSplit/>
-          <w:trHeight w:val="737"/>
-        </w:trPr>
-        <w:tc>
-          <w:tcPr>
-            <w:tcW w:type="dxa" w:w="4932"/>
-            <w:vAlign w:val="top"/>
-            <w:shd w:fill="F1F5F6"/>
-          </w:tcPr>
-          <w:p>
-            <w:pPr>
-              <w:spacing w:after="60" w:line="269" w:lineRule="auto"/>
-            </w:pPr>
-            <w:r>
-              <w:rPr>
-                <w:rFonts w:ascii="Arial" w:hAnsi="Arial"/>
-                <w:b w:val="0"/>
-                <w:color w:val="18233F"/>
-                <w:sz w:val="22"/>
-              </w:rPr>
-              <w:t>4 · MOST SUGAR PER 100 g</w:t>
-            </w:r>
-          </w:p>
-        </w:tc>
-        <w:tc>
-          <w:tcPr>
-            <w:tcW w:type="dxa" w:w="4932"/>
-            <w:vAlign w:val="top"/>
-            <w:shd w:fill="F1F5F6"/>
-          </w:tcPr>
-          <w:p>
-            <w:pPr>
-              <w:spacing w:after="60" w:line="269" w:lineRule="auto"/>
-            </w:pPr>
-            <w:r>
-              <w:rPr>
-                <w:rFonts w:ascii="Arial" w:hAnsi="Arial"/>
-                <w:b w:val="0"/>
-                <w:color w:val="18233F"/>
-                <w:sz w:val="22"/>
-              </w:rPr>
-            </w:r>
-          </w:p>
-        </w:tc>
-      </w:tr>
-      <w:tr>
-        <w:trPr>
-          <w:cantSplit/>
-          <w:trHeight w:val="737"/>
-        </w:trPr>
-        <w:tc>
-          <w:tcPr>
-            <w:tcW w:type="dxa" w:w="4932"/>
-            <w:vAlign w:val="top"/>
-            <w:shd w:fill="FFFFFF"/>
-          </w:tcPr>
-          <w:p>
-            <w:pPr>
-              <w:spacing w:after="60" w:line="269" w:lineRule="auto"/>
-            </w:pPr>
-            <w:r>
-              <w:rPr>
-                <w:rFonts w:ascii="Arial" w:hAnsi="Arial"/>
-                <w:b w:val="0"/>
-                <w:color w:val="18233F"/>
-                <w:sz w:val="22"/>
-              </w:rPr>
-              <w:t>FAIR-COMPARISON RULE</w:t>
-            </w:r>
-          </w:p>
-        </w:tc>
-        <w:tc>
-          <w:tcPr>
-            <w:tcW w:type="dxa" w:w="4932"/>
-            <w:vAlign w:val="top"/>
-            <w:shd w:fill="FFFFFF"/>
-          </w:tcPr>
-          <w:p>
-            <w:pPr>
-              <w:spacing w:after="60" w:line="269" w:lineRule="auto"/>
-            </w:pPr>
-            <w:r>
-              <w:rPr>
-                <w:rFonts w:ascii="Arial" w:hAnsi="Arial"/>
-                <w:b w:val="0"/>
-                <w:color w:val="18233F"/>
-                <w:sz w:val="22"/>
-              </w:rPr>
-            </w:r>
-          </w:p>
-        </w:tc>
-      </w:tr>
-      <w:tr>
-        <w:trPr>
-          <w:cantSplit/>
-          <w:trHeight w:val="737"/>
-        </w:trPr>
-        <w:tc>
-          <w:tcPr>
-            <w:tcW w:type="dxa" w:w="4932"/>
-            <w:vAlign w:val="top"/>
-            <w:shd w:fill="F1F5F6"/>
-          </w:tcPr>
-          <w:p>
-            <w:pPr>
-              <w:spacing w:after="60" w:line="269" w:lineRule="auto"/>
-            </w:pPr>
-            <w:r>
-              <w:rPr>
-                <w:rFonts w:ascii="Arial" w:hAnsi="Arial"/>
-                <w:b w:val="0"/>
-                <w:color w:val="18233F"/>
-                <w:sz w:val="22"/>
-              </w:rPr>
-              <w:t>LIMIT OF THE CLAIM</w:t>
-            </w:r>
-          </w:p>
-        </w:tc>
-        <w:tc>
-          <w:tcPr>
-            <w:tcW w:type="dxa" w:w="4932"/>
-            <w:vAlign w:val="top"/>
-            <w:shd w:fill="F1F5F6"/>
-          </w:tcPr>
-          <w:p>
-            <w:pPr>
-              <w:spacing w:after="60" w:line="269" w:lineRule="auto"/>
-            </w:pPr>
-            <w:r>
-              <w:rPr>
-                <w:rFonts w:ascii="Arial" w:hAnsi="Arial"/>
-                <w:b w:val="0"/>
-                <w:color w:val="18233F"/>
-                <w:sz w:val="22"/>
-              </w:rPr>
+              <w:br/>
+              <w:t>____________________________</w:t>
+              <w:br/>
+              <w:br/>
+              <w:t>____________________________</w:t>
+              <w:br/>
             </w:r>
           </w:p>
         </w:tc>
       </w:tr>
     </w:tbl>
     <w:p>
-      <w:pPr>
-        <w:spacing w:after="0"/>
-      </w:pPr>
+      <w:r>
+        <w:br w:type="page"/>
+      </w:r>
     </w:p>
     <w:p>
       <w:pPr>
-        <w:pStyle w:val="Heading2"/>
+        <w:pStyle w:val="Heading1"/>
       </w:pPr>
       <w:r>
-        <w:t>Activity cards</w:t>
+        <w:t>Your task Supported</w:t>
+      </w:r>
+    </w:p>
+    <w:p>
+      <w:r>
+        <w:rPr>
+          <w:b w:val="0"/>
+        </w:rPr>
+        <w:t>Use the shared label cards. Choose a book, this paper or a spoken response. You only need to answer once.</w:t>
+      </w:r>
+    </w:p>
+    <w:p>
+      <w:r>
+        <w:rPr>
+          <w:b/>
+        </w:rPr>
+        <w:t>1. Use these fictional teaching cards. All give sugar in g per 100 g: A - 4 g; B - 9 g; C - 14 g; D - 23 g.</w:t>
+      </w:r>
+    </w:p>
+    <w:p>
+      <w:r>
+        <w:rPr>
+          <w:b w:val="0"/>
+        </w:rPr>
+        <w:t>Help if useful: Use a paper strip to track one card at a time. Say or point to the letter, the sugar number and ‘g per 100 g' together.</w:t>
+      </w:r>
+    </w:p>
+    <w:p>
+      <w:r>
+        <w:rPr>
+          <w:b w:val="0"/>
+        </w:rPr>
+        <w:t>___________________________________________________________________</w:t>
+      </w:r>
+    </w:p>
+    <w:p>
+      <w:r>
+        <w:rPr>
+          <w:b w:val="0"/>
+        </w:rPr>
+        <w:t>___________________________________________________________________</w:t>
+      </w:r>
+    </w:p>
+    <w:p>
+      <w:r>
+        <w:rPr>
+          <w:b/>
+        </w:rPr>
+        <w:t>2. Put the four cards in order from LEAST sugar per 100 g to MOST. Point, move paper cards or direct an adult.</w:t>
+      </w:r>
+    </w:p>
+    <w:p>
+      <w:r>
+        <w:rPr>
+          <w:b w:val="0"/>
+        </w:rPr>
+        <w:t>Help if useful: Compare two numbers first. Place the smaller one towards LEAST, then find where each remaining card belongs.</w:t>
+      </w:r>
+    </w:p>
+    <w:p>
+      <w:r>
+        <w:rPr>
+          <w:b w:val="0"/>
+        </w:rPr>
+        <w:t>___________________________________________________________________</w:t>
+      </w:r>
+    </w:p>
+    <w:p>
+      <w:r>
+        <w:rPr>
+          <w:b w:val="0"/>
+        </w:rPr>
+        <w:t>___________________________________________________________________</w:t>
+      </w:r>
+    </w:p>
+    <w:p>
+      <w:r>
+        <w:rPr>
+          <w:b/>
+        </w:rPr>
+        <w:t>3. Complete: Label ___ has the least sugar per 100 g. Label ___ has the most.</w:t>
+      </w:r>
+    </w:p>
+    <w:p>
+      <w:r>
+        <w:rPr>
+          <w:b w:val="0"/>
+        </w:rPr>
+        <w:t>Help if useful: Look at the two ends of your own order. Use those card letters to fill the gaps.</w:t>
+      </w:r>
+    </w:p>
+    <w:p>
+      <w:r>
+        <w:rPr>
+          <w:b w:val="0"/>
+        </w:rPr>
+        <w:t>___________________________________________________________________</w:t>
+      </w:r>
+    </w:p>
+    <w:p>
+      <w:r>
+        <w:rPr>
+          <w:b w:val="0"/>
+        </w:rPr>
+        <w:t>___________________________________________________________________</w:t>
+      </w:r>
+    </w:p>
+    <w:p>
+      <w:r>
+        <w:br w:type="page"/>
+      </w:r>
+    </w:p>
+    <w:p>
+      <w:pPr>
+        <w:pStyle w:val="Heading1"/>
+      </w:pPr>
+      <w:r>
+        <w:t>Your task Supported continued</w:t>
+      </w:r>
+    </w:p>
+    <w:p>
+      <w:r>
+        <w:rPr>
+          <w:b w:val="0"/>
+        </w:rPr>
+        <w:t>Use the shared label cards. Choose a book, this paper or a spoken response. You only need to answer once.</w:t>
+      </w:r>
+    </w:p>
+    <w:p>
+      <w:r>
+        <w:rPr>
+          <w:b/>
+        </w:rPr>
+        <w:t>4. Choose the claim we can support: 'A has less sugar per 100 g than D' / 'A is the healthiest food for everyone'.</w:t>
+      </w:r>
+    </w:p>
+    <w:p>
+      <w:r>
+        <w:rPr>
+          <w:b w:val="0"/>
+        </w:rPr>
+        <w:t>Help if useful: Ask: does this sentence describe the sugar evidence, or claim to know everything about the food?</w:t>
+      </w:r>
+    </w:p>
+    <w:p>
+      <w:r>
+        <w:rPr>
+          <w:b w:val="0"/>
+        </w:rPr>
+        <w:t>___________________________________________________________________</w:t>
+      </w:r>
+    </w:p>
+    <w:p>
+      <w:r>
+        <w:rPr>
+          <w:b w:val="0"/>
+        </w:rPr>
+        <w:t>___________________________________________________________________</w:t>
+      </w:r>
+    </w:p>
+    <w:p>
+      <w:r>
+        <w:rPr>
+          <w:b w:val="0"/>
+        </w:rPr>
+        <w:t>___________________________________________________________________</w:t>
+      </w:r>
+    </w:p>
+    <w:p>
+      <w:r>
+        <w:rPr>
+          <w:b/>
+        </w:rPr>
+        <w:t>5. Finish or point: These sugar numbers show ONE PART OF NUTRITION / THE WHOLE EATING PATTERN. Keep "g per 100 g" with each number.</w:t>
+      </w:r>
+    </w:p>
+    <w:p>
+      <w:r>
+        <w:rPr>
+          <w:b w:val="0"/>
+        </w:rPr>
+        <w:t>Help if useful: Look at what was measured. Think about whether these cards show every nutrient and everything a person eats.</w:t>
+      </w:r>
+    </w:p>
+    <w:p>
+      <w:r>
+        <w:rPr>
+          <w:b w:val="0"/>
+        </w:rPr>
+        <w:t>___________________________________________________________________</w:t>
+      </w:r>
+    </w:p>
+    <w:p>
+      <w:r>
+        <w:rPr>
+          <w:b w:val="0"/>
+        </w:rPr>
+        <w:t>___________________________________________________________________</w:t>
+      </w:r>
+    </w:p>
+    <w:p>
+      <w:r>
+        <w:rPr>
+          <w:b w:val="0"/>
+        </w:rPr>
+        <w:t>___________________________________________________________________</w:t>
+      </w:r>
+    </w:p>
+    <w:p>
+      <w:r>
+        <w:br w:type="page"/>
+      </w:r>
+    </w:p>
+    <w:p>
+      <w:pPr>
+        <w:pStyle w:val="Heading1"/>
+      </w:pPr>
+      <w:r>
+        <w:t>Exit ticket Supported</w:t>
+      </w:r>
+    </w:p>
+    <w:p>
+      <w:r>
+        <w:rPr>
+          <w:b w:val="0"/>
+        </w:rPr>
+        <w:t>Name ____________________</w:t>
+        <w:br/>
+        <w:t>Point, circle, say or write. An adult can scribe. Choose this ticket or the screen or your book.</w:t>
       </w:r>
     </w:p>
     <w:tbl>
       <w:tblPr>
-        <w:tblW w:type="dxa" w:w="9865"/>
-        <w:jc w:val="center"/>
+        <w:tblW w:type="auto" w:w="0"/>
         <w:tblLayout w:type="fixed"/>
         <w:tblLook w:firstColumn="1" w:firstRow="1" w:lastColumn="0" w:lastRow="0" w:noHBand="0" w:noVBand="1" w:val="04A0"/>
-        <w:tblInd w:w="0" w:type="dxa"/>
-        <w:tblCellMar>
-          <w:top w:w="90" w:type="dxa"/>
-          <w:left w:w="90" w:type="dxa"/>
-          <w:bottom w:w="90" w:type="dxa"/>
-          <w:right w:w="90" w:type="dxa"/>
-        </w:tblCellMar>
+        <w:tblBorders>
+          <w:top w:val="single" w:sz="5" w:color="D9D9D9"/>
+          <w:left w:val="single" w:sz="5" w:color="D9D9D9"/>
+          <w:bottom w:val="single" w:sz="5" w:color="D9D9D9"/>
+          <w:right w:val="single" w:sz="5" w:color="D9D9D9"/>
+          <w:insideH w:val="single" w:sz="5" w:color="D9D9D9"/>
+          <w:insideV w:val="single" w:sz="5" w:color="D9D9D9"/>
+        </w:tblBorders>
       </w:tblPr>
       <w:tblGrid>
-        <w:gridCol w:w="4932"/>
-        <w:gridCol w:w="4932"/>
+        <w:gridCol w:w="5046"/>
+        <w:gridCol w:w="5046"/>
       </w:tblGrid>
       <w:tr>
         <w:trPr>
-          <w:cantSplit/>
           <w:tblHeader/>
         </w:trPr>
         <w:tc>
           <w:tcPr>
-            <w:tcW w:type="dxa" w:w="4932"/>
-            <w:vAlign w:val="top"/>
-            <w:shd w:fill="4E7A9B"/>
+            <w:tcW w:type="dxa" w:w="5046"/>
+            <w:tcMar>
+              <w:top w:w="110" w:type="dxa"/>
+              <w:bottom w:w="110" w:type="dxa"/>
+              <w:left w:w="110" w:type="dxa"/>
+              <w:right w:w="110" w:type="dxa"/>
+            </w:tcMar>
+            <w:shd w:fill="E8EFF4"/>
           </w:tcPr>
           <w:p>
             <w:pPr>
-              <w:spacing w:after="60" w:line="269" w:lineRule="auto"/>
+              <w:spacing w:after="60"/>
             </w:pPr>
             <w:r>
               <w:rPr>
-                <w:rFonts w:ascii="Arial" w:hAnsi="Arial"/>
                 <w:b/>
-                <w:color w:val="FFFFFF"/>
                 <w:sz w:val="22"/>
               </w:rPr>
-              <w:t>1 · Label A · 4 g per 100 g</w:t>
+              <w:t>Label B</w:t>
             </w:r>
           </w:p>
         </w:tc>
         <w:tc>
           <w:tcPr>
-            <w:tcW w:type="dxa" w:w="4932"/>
-            <w:vAlign w:val="top"/>
-            <w:shd w:fill="4E7A9B"/>
+            <w:tcW w:type="dxa" w:w="5046"/>
+            <w:tcMar>
+              <w:top w:w="110" w:type="dxa"/>
+              <w:bottom w:w="110" w:type="dxa"/>
+              <w:left w:w="110" w:type="dxa"/>
+              <w:right w:w="110" w:type="dxa"/>
+            </w:tcMar>
+            <w:shd w:fill="E8EFF4"/>
           </w:tcPr>
           <w:p>
             <w:pPr>
-              <w:spacing w:after="60" w:line="269" w:lineRule="auto"/>
+              <w:spacing w:after="60"/>
             </w:pPr>
             <w:r>
               <w:rPr>
-                <w:rFonts w:ascii="Arial" w:hAnsi="Arial"/>
                 <w:b/>
-                <w:color w:val="FFFFFF"/>
                 <w:sz w:val="22"/>
               </w:rPr>
-              <w:t>2 · Label B · 9 g per 100 g</w:t>
+              <w:t>Label C</w:t>
             </w:r>
           </w:p>
         </w:tc>
       </w:tr>
       <w:tr>
-        <w:trPr>
-          <w:cantSplit/>
-        </w:trPr>
         <w:tc>
           <w:tcPr>
-            <w:tcW w:type="dxa" w:w="4932"/>
-            <w:vAlign w:val="top"/>
-            <w:shd w:fill="FFFFFF"/>
+            <w:tcW w:type="dxa" w:w="5046"/>
+            <w:tcMar>
+              <w:top w:w="110" w:type="dxa"/>
+              <w:bottom w:w="110" w:type="dxa"/>
+              <w:left w:w="110" w:type="dxa"/>
+              <w:right w:w="110" w:type="dxa"/>
+            </w:tcMar>
           </w:tcPr>
           <w:p>
             <w:pPr>
-              <w:spacing w:after="60" w:line="269" w:lineRule="auto"/>
+              <w:spacing w:after="60"/>
             </w:pPr>
             <w:r>
               <w:rPr>
-                <w:rFonts w:ascii="Arial" w:hAnsi="Arial"/>
                 <w:b w:val="0"/>
-                <w:color w:val="18233F"/>
                 <w:sz w:val="22"/>
               </w:rPr>
-              <w:t>The supplied sugar line reads 4 g for each 100 g.</w:t>
+              <w:t>9 g sugars per 100 g</w:t>
             </w:r>
           </w:p>
         </w:tc>
         <w:tc>
           <w:tcPr>
-            <w:tcW w:type="dxa" w:w="4932"/>
-            <w:vAlign w:val="top"/>
-            <w:shd w:fill="FFFFFF"/>
+            <w:tcW w:type="dxa" w:w="5046"/>
+            <w:tcMar>
+              <w:top w:w="110" w:type="dxa"/>
+              <w:bottom w:w="110" w:type="dxa"/>
+              <w:left w:w="110" w:type="dxa"/>
+              <w:right w:w="110" w:type="dxa"/>
+            </w:tcMar>
           </w:tcPr>
           <w:p>
             <w:pPr>
-              <w:spacing w:after="60" w:line="269" w:lineRule="auto"/>
+              <w:spacing w:after="60"/>
             </w:pPr>
             <w:r>
               <w:rPr>
-                <w:rFonts w:ascii="Arial" w:hAnsi="Arial"/>
                 <w:b w:val="0"/>
-                <w:color w:val="18233F"/>
                 <w:sz w:val="22"/>
               </w:rPr>
-              <w:t>The supplied sugar line reads 9 g for each 100 g.</w:t>
+              <w:t>14 g sugars per 100 g</w:t>
             </w:r>
           </w:p>
         </w:tc>
       </w:tr>
     </w:tbl>
     <w:p>
+      <w:r>
+        <w:rPr>
+          <w:b/>
+        </w:rPr>
+        <w:t>1. Which label has less sugar per 100 g?</w:t>
+      </w:r>
+    </w:p>
+    <w:p>
+      <w:r>
+        <w:rPr>
+          <w:b w:val="0"/>
+        </w:rPr>
+        <w:t>B  9 g per 100 g       /       C  14 g per 100 g</w:t>
+      </w:r>
+    </w:p>
+    <w:p>
+      <w:r>
+        <w:rPr>
+          <w:b/>
+        </w:rPr>
+        <w:t>2. What do these two numbers tell us?</w:t>
+      </w:r>
+    </w:p>
+    <w:p>
+      <w:r>
+        <w:rPr>
+          <w:b w:val="0"/>
+        </w:rPr>
+        <w:t>The amount of sugar       /       Everything about the food</w:t>
+      </w:r>
+    </w:p>
+    <w:p>
+      <w:r>
+        <w:rPr>
+          <w:b w:val="0"/>
+        </w:rPr>
+        <w:t>Next lesson: Body Science Checkpoint</w:t>
+      </w:r>
+    </w:p>
+    <w:p>
+      <w:r>
+        <w:br w:type="page"/>
+      </w:r>
+    </w:p>
+    <w:p>
       <w:pPr>
-        <w:spacing w:after="0"/>
+        <w:pStyle w:val="Heading1"/>
       </w:pPr>
+      <w:r>
+        <w:t>Arrival task Standard</w:t>
+      </w:r>
+    </w:p>
+    <w:p>
+      <w:r>
+        <w:rPr>
+          <w:b w:val="0"/>
+        </w:rPr>
+        <w:t>Choose the route that helps you show your thinking. Say, point, sign, draw or write. An adult may read the words. These clues also help if this is new.</w:t>
+      </w:r>
     </w:p>
     <w:tbl>
       <w:tblPr>
-        <w:tblW w:type="dxa" w:w="9865"/>
-        <w:jc w:val="center"/>
-        <w:tblLayout w:type="fixed"/>
+        <w:tblW w:type="auto" w:w="0"/>
         <w:tblLook w:firstColumn="1" w:firstRow="1" w:lastColumn="0" w:lastRow="0" w:noHBand="0" w:noVBand="1" w:val="04A0"/>
-        <w:tblInd w:w="0" w:type="dxa"/>
-        <w:tblCellMar>
-          <w:top w:w="90" w:type="dxa"/>
-          <w:left w:w="90" w:type="dxa"/>
-          <w:bottom w:w="90" w:type="dxa"/>
-          <w:right w:w="90" w:type="dxa"/>
-        </w:tblCellMar>
       </w:tblPr>
       <w:tblGrid>
-        <w:gridCol w:w="4932"/>
-        <w:gridCol w:w="4932"/>
+        <w:gridCol w:w="5046"/>
+        <w:gridCol w:w="5046"/>
       </w:tblGrid>
       <w:tr>
-        <w:trPr>
-          <w:cantSplit/>
-          <w:tblHeader/>
-        </w:trPr>
         <w:tc>
           <w:tcPr>
-            <w:tcW w:type="dxa" w:w="4932"/>
-            <w:vAlign w:val="top"/>
-            <w:shd w:fill="4E7A9B"/>
+            <w:tcW w:type="dxa" w:w="5046"/>
           </w:tcPr>
           <w:p>
             <w:pPr>
-              <w:spacing w:after="60" w:line="269" w:lineRule="auto"/>
+              <w:spacing w:after="160"/>
             </w:pPr>
             <w:r>
               <w:rPr>
-                <w:rFonts w:ascii="Arial" w:hAnsi="Arial"/>
                 <w:b/>
-                <w:color w:val="FFFFFF"/>
-                <w:sz w:val="22"/>
               </w:rPr>
-              <w:t>3 · Label C · 14 g per 100 g</w:t>
+              <w:t>1. Read the arrow</w:t>
+            </w:r>
+          </w:p>
+          <w:p>
+            <w:pPr>
+              <w:spacing w:after="160"/>
+            </w:pPr>
+            <w:r>
+              <w:t>Plant → caterpillar → bird. What does the arrow from plant to caterpillar show?</w:t>
+            </w:r>
+          </w:p>
+          <w:p>
+            <w:pPr>
+              <w:spacing w:after="160"/>
+            </w:pPr>
+            <w:r>
+              <w:rPr>
+                <w:i/>
+                <w:sz w:val="20"/>
+              </w:rPr>
+              <w:t>Think about food and energy transfer.</w:t>
+            </w:r>
+          </w:p>
+          <w:p>
+            <w:pPr>
+              <w:spacing w:after="160"/>
+            </w:pPr>
+            <w:r>
+              <w:br/>
+              <w:t>____________________________</w:t>
+              <w:br/>
+              <w:br/>
+              <w:t>____________________________</w:t>
+              <w:br/>
             </w:r>
           </w:p>
         </w:tc>
         <w:tc>
           <w:tcPr>
-            <w:tcW w:type="dxa" w:w="4932"/>
-            <w:vAlign w:val="top"/>
-            <w:shd w:fill="4E7A9B"/>
+            <w:tcW w:type="dxa" w:w="5046"/>
           </w:tcPr>
           <w:p>
             <w:pPr>
-              <w:spacing w:after="60" w:line="269" w:lineRule="auto"/>
+              <w:spacing w:after="160"/>
             </w:pPr>
             <w:r>
               <w:rPr>
-                <w:rFonts w:ascii="Arial" w:hAnsi="Arial"/>
                 <w:b/>
-                <w:color w:val="FFFFFF"/>
-                <w:sz w:val="22"/>
               </w:rPr>
-              <w:t>4 · Label D · 23 g per 100 g</w:t>
+              <w:t>2. Recall body jobs</w:t>
+            </w:r>
+          </w:p>
+          <w:p>
+            <w:pPr>
+              <w:spacing w:after="160"/>
+            </w:pPr>
+            <w:r>
+              <w:t>Name two jobs that nutrients from food support.</w:t>
+            </w:r>
+          </w:p>
+          <w:p>
+            <w:pPr>
+              <w:spacing w:after="160"/>
+            </w:pPr>
+            <w:r>
+              <w:rPr>
+                <w:i/>
+                <w:sz w:val="20"/>
+              </w:rPr>
+              <w:t>Think about energy, growth or repair.</w:t>
+            </w:r>
+          </w:p>
+          <w:p>
+            <w:pPr>
+              <w:spacing w:after="160"/>
+            </w:pPr>
+            <w:r>
+              <w:br/>
+              <w:t>____________________________</w:t>
+              <w:br/>
+              <w:br/>
+              <w:t>____________________________</w:t>
+              <w:br/>
             </w:r>
           </w:p>
         </w:tc>
       </w:tr>
       <w:tr>
-        <w:trPr>
-          <w:cantSplit/>
-        </w:trPr>
         <w:tc>
           <w:tcPr>
-            <w:tcW w:type="dxa" w:w="4932"/>
-            <w:vAlign w:val="top"/>
-            <w:shd w:fill="FFFFFF"/>
+            <w:tcW w:type="dxa" w:w="5046"/>
           </w:tcPr>
           <w:p>
             <w:pPr>
-              <w:spacing w:after="60" w:line="269" w:lineRule="auto"/>
+              <w:spacing w:after="160"/>
             </w:pPr>
             <w:r>
               <w:rPr>
-                <w:rFonts w:ascii="Arial" w:hAnsi="Arial"/>
-                <w:b w:val="0"/>
-                <w:color w:val="18233F"/>
-                <w:sz w:val="22"/>
+                <w:b/>
               </w:rPr>
-              <w:t>The supplied sugar line reads 14 g for each 100 g.</w:t>
+              <w:t>3. Explain variety</w:t>
+            </w:r>
+          </w:p>
+          <w:p>
+            <w:pPr>
+              <w:spacing w:after="160"/>
+            </w:pPr>
+            <w:r>
+              <w:t>Why does a balanced eating pattern include a range of foods?</w:t>
+            </w:r>
+          </w:p>
+          <w:p>
+            <w:pPr>
+              <w:spacing w:after="160"/>
+            </w:pPr>
+            <w:r>
+              <w:rPr>
+                <w:i/>
+                <w:sz w:val="20"/>
+              </w:rPr>
+              <w:t>Different foods supply different nutrients.</w:t>
+            </w:r>
+          </w:p>
+          <w:p>
+            <w:pPr>
+              <w:spacing w:after="160"/>
+            </w:pPr>
+            <w:r>
+              <w:br/>
+              <w:t>____________________________</w:t>
+              <w:br/>
+              <w:br/>
+              <w:t>____________________________</w:t>
+              <w:br/>
             </w:r>
           </w:p>
         </w:tc>
         <w:tc>
           <w:tcPr>
-            <w:tcW w:type="dxa" w:w="4932"/>
-            <w:vAlign w:val="top"/>
-            <w:shd w:fill="FFFFFF"/>
+            <w:tcW w:type="dxa" w:w="5046"/>
           </w:tcPr>
           <w:p>
             <w:pPr>
-              <w:spacing w:after="60" w:line="269" w:lineRule="auto"/>
+              <w:spacing w:after="160"/>
             </w:pPr>
             <w:r>
               <w:rPr>
-                <w:rFonts w:ascii="Arial" w:hAnsi="Arial"/>
-                <w:b w:val="0"/>
-                <w:color w:val="18233F"/>
-                <w:sz w:val="22"/>
+                <w:b/>
               </w:rPr>
-              <w:t>The supplied sugar line reads 23 g for each 100 g.</w:t>
+              <w:t>4. Read all three</w:t>
+            </w:r>
+          </w:p>
+          <w:p>
+            <w:pPr>
+              <w:spacing w:after="160"/>
+            </w:pPr>
+            <w:r>
+              <w:t>A label says 'of which sugars: 4 g per 100 g'. Give the number, unit and basis.</w:t>
+            </w:r>
+          </w:p>
+          <w:p>
+            <w:pPr>
+              <w:spacing w:after="160"/>
+            </w:pPr>
+            <w:r>
+              <w:rPr>
+                <w:i/>
+                <w:sz w:val="20"/>
+              </w:rPr>
+              <w:t>Number = how much; unit = what measure; basis = in how much food.</w:t>
+            </w:r>
+          </w:p>
+          <w:p>
+            <w:pPr>
+              <w:spacing w:after="160"/>
+            </w:pPr>
+            <w:r>
+              <w:br/>
+              <w:t>____________________________</w:t>
+              <w:br/>
+              <w:br/>
+              <w:t>____________________________</w:t>
+              <w:br/>
             </w:r>
           </w:p>
         </w:tc>
       </w:tr>
     </w:tbl>
     <w:p>
+      <w:r>
+        <w:br w:type="page"/>
+      </w:r>
+    </w:p>
+    <w:p>
       <w:pPr>
-        <w:spacing w:after="0"/>
+        <w:pStyle w:val="Heading1"/>
       </w:pPr>
+      <w:r>
+        <w:t>Your task Standard</w:t>
+      </w:r>
+    </w:p>
+    <w:p>
+      <w:r>
+        <w:rPr>
+          <w:b w:val="0"/>
+        </w:rPr>
+        <w:t>Use the shared label cards. Choose a book, this paper or a spoken response. You only need to answer once.</w:t>
+      </w:r>
+    </w:p>
+    <w:p>
+      <w:r>
+        <w:rPr>
+          <w:b/>
+        </w:rPr>
+        <w:t>1. Read these fictional teaching labels. Each is PER 100 g. A: carbohydrate 22 g; of which sugars 4 g. B: carbohydrate 67 g; of which sugars 9 g. C: carbohydrate 58 g; of which sugars 14 g. D: carbohydrate 72 g; of which sugars 23 g.</w:t>
+      </w:r>
+    </w:p>
+    <w:p>
+      <w:r>
+        <w:rPr>
+          <w:b w:val="0"/>
+        </w:rPr>
+        <w:t>Help if useful: Track the ‘of which sugars' row. Keep the carbohydrate and sugar rows separate.</w:t>
+      </w:r>
+    </w:p>
+    <w:p>
+      <w:r>
+        <w:rPr>
+          <w:b w:val="0"/>
+        </w:rPr>
+        <w:t>___________________________________________________________________</w:t>
+      </w:r>
+    </w:p>
+    <w:p>
+      <w:r>
+        <w:rPr>
+          <w:b w:val="0"/>
+        </w:rPr>
+        <w:t>___________________________________________________________________</w:t>
+      </w:r>
+    </w:p>
+    <w:p>
+      <w:r>
+        <w:rPr>
+          <w:b/>
+        </w:rPr>
+        <w:t>2. Make a results row for each label. Copy the SUGAR value with its unit and basis; do not copy total carbohydrate.</w:t>
+      </w:r>
+    </w:p>
+    <w:p>
+      <w:r>
+        <w:rPr>
+          <w:b w:val="0"/>
+        </w:rPr>
+        <w:t>Help if useful: Use the headings Label | Sugar / g per 100 g. Check each copied value against its nutrient name.</w:t>
+      </w:r>
+    </w:p>
+    <w:p>
+      <w:r>
+        <w:rPr>
+          <w:b w:val="0"/>
+        </w:rPr>
+        <w:t>___________________________________________________________________</w:t>
+      </w:r>
+    </w:p>
+    <w:p>
+      <w:r>
+        <w:rPr>
+          <w:b w:val="0"/>
+        </w:rPr>
+        <w:t>___________________________________________________________________</w:t>
+      </w:r>
+    </w:p>
+    <w:p>
+      <w:r>
+        <w:rPr>
+          <w:b/>
+        </w:rPr>
+        <w:t>3. Order A-D from least to most sugar per 100 g.</w:t>
+      </w:r>
+    </w:p>
+    <w:p>
+      <w:r>
+        <w:rPr>
+          <w:b w:val="0"/>
+        </w:rPr>
+        <w:t>Help if useful: Check adjacent pairs: is each value no larger than the next? Recheck that all four use the same basis.</w:t>
+      </w:r>
+    </w:p>
+    <w:p>
+      <w:r>
+        <w:rPr>
+          <w:b w:val="0"/>
+        </w:rPr>
+        <w:t>___________________________________________________________________</w:t>
+      </w:r>
+    </w:p>
+    <w:p>
+      <w:r>
+        <w:rPr>
+          <w:b w:val="0"/>
+        </w:rPr>
+        <w:t>___________________________________________________________________</w:t>
+      </w:r>
+    </w:p>
+    <w:p>
+      <w:r>
+        <w:br w:type="page"/>
+      </w:r>
+    </w:p>
+    <w:p>
+      <w:pPr>
+        <w:pStyle w:val="Heading1"/>
+      </w:pPr>
+      <w:r>
+        <w:t>Your task Standard continued</w:t>
+      </w:r>
+    </w:p>
+    <w:p>
+      <w:r>
+        <w:rPr>
+          <w:b w:val="0"/>
+        </w:rPr>
+        <w:t>Use the shared label cards. Choose a book, this paper or a spoken response. You only need to answer once.</w:t>
+      </w:r>
+    </w:p>
+    <w:p>
+      <w:r>
+        <w:rPr>
+          <w:b/>
+        </w:rPr>
+        <w:t>4. Write or say one comparison: 'Label ___ has ___ g sugar per 100 g. This is less/more than ___.'</w:t>
+      </w:r>
+    </w:p>
+    <w:p>
+      <w:r>
+        <w:rPr>
+          <w:b w:val="0"/>
+        </w:rPr>
+        <w:t>Help if useful: Build the comparison from two complete readings. Include which label you are comparing it with.</w:t>
+      </w:r>
+    </w:p>
+    <w:p>
+      <w:r>
+        <w:rPr>
+          <w:b w:val="0"/>
+        </w:rPr>
+        <w:t>___________________________________________________________________</w:t>
+      </w:r>
+    </w:p>
+    <w:p>
+      <w:r>
+        <w:rPr>
+          <w:b w:val="0"/>
+        </w:rPr>
+        <w:t>___________________________________________________________________</w:t>
+      </w:r>
+    </w:p>
+    <w:p>
+      <w:r>
+        <w:rPr>
+          <w:b w:val="0"/>
+        </w:rPr>
+        <w:t>___________________________________________________________________</w:t>
+      </w:r>
+    </w:p>
+    <w:p>
+      <w:r>
+        <w:rPr>
+          <w:b/>
+        </w:rPr>
+        <w:t>5. Explain one thing these sugar numbers cannot tell us about the whole food or eating pattern.</w:t>
+      </w:r>
+    </w:p>
+    <w:p>
+      <w:r>
+        <w:rPr>
+          <w:b w:val="0"/>
+        </w:rPr>
+        <w:t>Help if useful: Choose one missing piece of information. Explain why that missing information limits a wider judgement.</w:t>
+      </w:r>
+    </w:p>
+    <w:p>
+      <w:r>
+        <w:rPr>
+          <w:b w:val="0"/>
+        </w:rPr>
+        <w:t>___________________________________________________________________</w:t>
+      </w:r>
+    </w:p>
+    <w:p>
+      <w:r>
+        <w:rPr>
+          <w:b w:val="0"/>
+        </w:rPr>
+        <w:t>___________________________________________________________________</w:t>
+      </w:r>
+    </w:p>
+    <w:p>
+      <w:r>
+        <w:rPr>
+          <w:b w:val="0"/>
+        </w:rPr>
+        <w:t>___________________________________________________________________</w:t>
+      </w:r>
+    </w:p>
+    <w:p>
+      <w:r>
+        <w:br w:type="page"/>
+      </w:r>
+    </w:p>
+    <w:p>
+      <w:pPr>
+        <w:pStyle w:val="Heading1"/>
+      </w:pPr>
+      <w:r>
+        <w:t>Exit ticket Standard</w:t>
+      </w:r>
+    </w:p>
+    <w:p>
+      <w:r>
+        <w:rPr>
+          <w:b w:val="0"/>
+        </w:rPr>
+        <w:t>Name ____________________</w:t>
+        <w:br/>
+        <w:t>Point, circle, say or write. An adult can scribe. Choose this ticket or the screen or your book.</w:t>
+      </w:r>
     </w:p>
     <w:tbl>
       <w:tblPr>
-        <w:tblW w:type="dxa" w:w="9865"/>
-        <w:jc w:val="center"/>
+        <w:tblW w:type="auto" w:w="0"/>
         <w:tblLayout w:type="fixed"/>
         <w:tblLook w:firstColumn="1" w:firstRow="1" w:lastColumn="0" w:lastRow="0" w:noHBand="0" w:noVBand="1" w:val="04A0"/>
-        <w:tblInd w:w="0" w:type="dxa"/>
-        <w:tblCellMar>
-          <w:top w:w="90" w:type="dxa"/>
-          <w:left w:w="90" w:type="dxa"/>
-          <w:bottom w:w="90" w:type="dxa"/>
-          <w:right w:w="90" w:type="dxa"/>
-        </w:tblCellMar>
+        <w:tblBorders>
+          <w:top w:val="single" w:sz="5" w:color="D9D9D9"/>
+          <w:left w:val="single" w:sz="5" w:color="D9D9D9"/>
+          <w:bottom w:val="single" w:sz="5" w:color="D9D9D9"/>
+          <w:right w:val="single" w:sz="5" w:color="D9D9D9"/>
+          <w:insideH w:val="single" w:sz="5" w:color="D9D9D9"/>
+          <w:insideV w:val="single" w:sz="5" w:color="D9D9D9"/>
+        </w:tblBorders>
       </w:tblPr>
       <w:tblGrid>
-        <w:gridCol w:w="4932"/>
-        <w:gridCol w:w="4932"/>
+        <w:gridCol w:w="5046"/>
+        <w:gridCol w:w="5046"/>
       </w:tblGrid>
       <w:tr>
         <w:trPr>
-          <w:cantSplit/>
           <w:tblHeader/>
         </w:trPr>
         <w:tc>
           <w:tcPr>
-            <w:tcW w:type="dxa" w:w="4932"/>
-            <w:vAlign w:val="top"/>
-            <w:shd w:fill="4E7A9B"/>
+            <w:tcW w:type="dxa" w:w="5046"/>
+            <w:tcMar>
+              <w:top w:w="110" w:type="dxa"/>
+              <w:bottom w:w="110" w:type="dxa"/>
+              <w:left w:w="110" w:type="dxa"/>
+              <w:right w:w="110" w:type="dxa"/>
+            </w:tcMar>
+            <w:shd w:fill="E8EFF4"/>
           </w:tcPr>
           <w:p>
             <w:pPr>
-              <w:spacing w:after="60" w:line="269" w:lineRule="auto"/>
+              <w:spacing w:after="60"/>
             </w:pPr>
             <w:r>
               <w:rPr>
-                <w:rFonts w:ascii="Arial" w:hAnsi="Arial"/>
                 <w:b/>
-                <w:color w:val="FFFFFF"/>
                 <w:sz w:val="22"/>
               </w:rPr>
-              <w:t>5 · Same nutrient, unit and basis</w:t>
+              <w:t>Label B</w:t>
             </w:r>
           </w:p>
         </w:tc>
         <w:tc>
           <w:tcPr>
-            <w:tcW w:type="dxa" w:w="4932"/>
-            <w:vAlign w:val="top"/>
-            <w:shd w:fill="4E7A9B"/>
+            <w:tcW w:type="dxa" w:w="5046"/>
+            <w:tcMar>
+              <w:top w:w="110" w:type="dxa"/>
+              <w:bottom w:w="110" w:type="dxa"/>
+              <w:left w:w="110" w:type="dxa"/>
+              <w:right w:w="110" w:type="dxa"/>
+            </w:tcMar>
+            <w:shd w:fill="E8EFF4"/>
           </w:tcPr>
           <w:p>
             <w:pPr>
-              <w:spacing w:after="60" w:line="269" w:lineRule="auto"/>
+              <w:spacing w:after="60"/>
             </w:pPr>
             <w:r>
               <w:rPr>
-                <w:rFonts w:ascii="Arial" w:hAnsi="Arial"/>
                 <w:b/>
-                <w:color w:val="FFFFFF"/>
                 <w:sz w:val="22"/>
               </w:rPr>
-              <w:t>6 · Sugar is one part of nutrition</w:t>
+              <w:t>Label C</w:t>
             </w:r>
           </w:p>
         </w:tc>
       </w:tr>
       <w:tr>
-        <w:trPr>
-          <w:cantSplit/>
-        </w:trPr>
         <w:tc>
           <w:tcPr>
-            <w:tcW w:type="dxa" w:w="4932"/>
-            <w:vAlign w:val="top"/>
-            <w:shd w:fill="FFFFFF"/>
+            <w:tcW w:type="dxa" w:w="5046"/>
+            <w:tcMar>
+              <w:top w:w="110" w:type="dxa"/>
+              <w:bottom w:w="110" w:type="dxa"/>
+              <w:left w:w="110" w:type="dxa"/>
+              <w:right w:w="110" w:type="dxa"/>
+            </w:tcMar>
           </w:tcPr>
           <w:p>
             <w:pPr>
-              <w:spacing w:after="60" w:line="269" w:lineRule="auto"/>
+              <w:spacing w:after="60"/>
             </w:pPr>
             <w:r>
               <w:rPr>
-                <w:rFonts w:ascii="Arial" w:hAnsi="Arial"/>
                 <w:b w:val="0"/>
-                <w:color w:val="18233F"/>
                 <w:sz w:val="22"/>
               </w:rPr>
-              <w:t>Every value is sugar in g per 100 g.</w:t>
+              <w:t>9 g sugars per 100 g</w:t>
             </w:r>
           </w:p>
         </w:tc>
         <w:tc>
           <w:tcPr>
-            <w:tcW w:type="dxa" w:w="4932"/>
-            <w:vAlign w:val="top"/>
-            <w:shd w:fill="FFFFFF"/>
+            <w:tcW w:type="dxa" w:w="5046"/>
+            <w:tcMar>
+              <w:top w:w="110" w:type="dxa"/>
+              <w:bottom w:w="110" w:type="dxa"/>
+              <w:left w:w="110" w:type="dxa"/>
+              <w:right w:w="110" w:type="dxa"/>
+            </w:tcMar>
           </w:tcPr>
           <w:p>
             <w:pPr>
-              <w:spacing w:after="60" w:line="269" w:lineRule="auto"/>
+              <w:spacing w:after="60"/>
             </w:pPr>
             <w:r>
               <w:rPr>
-                <w:rFonts w:ascii="Arial" w:hAnsi="Arial"/>
                 <w:b w:val="0"/>
-                <w:color w:val="18233F"/>
                 <w:sz w:val="22"/>
               </w:rPr>
-              <w:t>The cards do not show every nutrient, portion, medical need or the whole diet.</w:t>
+              <w:t>14 g sugars per 100 g</w:t>
             </w:r>
           </w:p>
         </w:tc>
       </w:tr>
     </w:tbl>
     <w:p>
-      <w:pPr>
-        <w:spacing w:after="0"/>
-      </w:pPr>
-    </w:p>
-    <w:p>
-      <w:pPr>
-        <w:keepNext/>
-      </w:pPr>
       <w:r>
-        <w:t>Read the ordered values with units and basis. What claim is supported, and what broader claim is not supported?</w:t>
+        <w:rPr>
+          <w:b/>
+        </w:rPr>
+        <w:t>1. Complete the comparison.</w:t>
       </w:r>
     </w:p>
     <w:p>
-      <w:pPr>
-        <w:keepNext/>
-        <w:spacing w:after="0" w:line="240" w:lineRule="auto"/>
-        <w:pBdr>
-          <w:bottom w:val="single" w:sz="3" w:color="D6DFE4" w:space="1"/>
-        </w:pBdr>
-      </w:pPr>
       <w:r>
         <w:rPr>
-          <w:sz w:val="40"/>
+          <w:b w:val="0"/>
         </w:rPr>
-        <w:t xml:space="preserve"> </w:t>
+        <w:t>Label B has  9 g / 14 g  sugars per 100 g.</w:t>
       </w:r>
     </w:p>
     <w:p>
-      <w:pPr>
-        <w:keepNext w:val="0"/>
-        <w:spacing w:after="0" w:line="240" w:lineRule="auto"/>
-        <w:pBdr>
-          <w:bottom w:val="single" w:sz="3" w:color="D6DFE4" w:space="1"/>
-        </w:pBdr>
-      </w:pPr>
       <w:r>
         <w:rPr>
-          <w:sz w:val="40"/>
+          <w:b w:val="0"/>
         </w:rPr>
-        <w:t xml:space="preserve"> </w:t>
+        <w:t>That is  less / more  than label C.</w:t>
+      </w:r>
+    </w:p>
+    <w:p>
+      <w:r>
+        <w:rPr>
+          <w:b/>
+        </w:rPr>
+        <w:t>2. Finish the idea.</w:t>
+      </w:r>
+    </w:p>
+    <w:p>
+      <w:r>
+        <w:rPr>
+          <w:b w:val="0"/>
+        </w:rPr>
+        <w:t>These numbers compare  sugar / every nutrient.</w:t>
+      </w:r>
+    </w:p>
+    <w:p>
+      <w:r>
+        <w:rPr>
+          <w:b w:val="0"/>
+        </w:rPr>
+        <w:t>They do not tell us everything about the food.</w:t>
+      </w:r>
+    </w:p>
+    <w:p>
+      <w:r>
+        <w:rPr>
+          <w:b w:val="0"/>
+        </w:rPr>
+        <w:t>Next lesson: Body Science Checkpoint</w:t>
+      </w:r>
+    </w:p>
+    <w:p>
+      <w:r>
+        <w:br w:type="page"/>
       </w:r>
     </w:p>
     <w:p>
       <w:pPr>
         <w:pStyle w:val="Heading1"/>
-        <w:pageBreakBefore/>
       </w:pPr>
       <w:r>
-        <w:t>Your lesson record</w:t>
+        <w:t>Arrival task Stretch</w:t>
       </w:r>
     </w:p>
     <w:p>
       <w:r>
-        <w:t>Read and order four supplied label cards from least to most sugar per 100 g, then write or communicate one supported claim and one limitation.</w:t>
+        <w:rPr>
+          <w:b w:val="0"/>
+        </w:rPr>
+        <w:t>Choose the route that helps you show your thinking. Say, point, sign, draw or write. An adult may read the words. These clues also help if this is new.</w:t>
       </w:r>
     </w:p>
+    <w:tbl>
+      <w:tblPr>
+        <w:tblW w:type="auto" w:w="0"/>
+        <w:tblLook w:firstColumn="1" w:firstRow="1" w:lastColumn="0" w:lastRow="0" w:noHBand="0" w:noVBand="1" w:val="04A0"/>
+      </w:tblPr>
+      <w:tblGrid>
+        <w:gridCol w:w="5046"/>
+        <w:gridCol w:w="5046"/>
+      </w:tblGrid>
+      <w:tr>
+        <w:tc>
+          <w:tcPr>
+            <w:tcW w:type="dxa" w:w="5046"/>
+          </w:tcPr>
+          <w:p>
+            <w:pPr>
+              <w:spacing w:after="160"/>
+            </w:pPr>
+            <w:r>
+              <w:rPr>
+                <w:b/>
+              </w:rPr>
+              <w:t>1. Use food-chain evidence</w:t>
+            </w:r>
+          </w:p>
+          <w:p>
+            <w:pPr>
+              <w:spacing w:after="160"/>
+            </w:pPr>
+            <w:r>
+              <w:t>Plant → caterpillar → bird. Explain why the arrows are not pointing towards what each animal hunts or eats.</w:t>
+            </w:r>
+          </w:p>
+          <w:p>
+            <w:pPr>
+              <w:spacing w:after="160"/>
+            </w:pPr>
+            <w:r>
+              <w:rPr>
+                <w:i/>
+                <w:sz w:val="20"/>
+              </w:rPr>
+              <w:t>Follow the transfer of food and energy.</w:t>
+            </w:r>
+          </w:p>
+          <w:p>
+            <w:pPr>
+              <w:spacing w:after="160"/>
+            </w:pPr>
+            <w:r>
+              <w:br/>
+              <w:t>____________________________</w:t>
+              <w:br/>
+              <w:br/>
+              <w:t>____________________________</w:t>
+              <w:br/>
+            </w:r>
+          </w:p>
+        </w:tc>
+        <w:tc>
+          <w:tcPr>
+            <w:tcW w:type="dxa" w:w="5046"/>
+          </w:tcPr>
+          <w:p>
+            <w:pPr>
+              <w:spacing w:after="160"/>
+            </w:pPr>
+            <w:r>
+              <w:rPr>
+                <w:b/>
+              </w:rPr>
+              <w:t>2. Separate the claims</w:t>
+            </w:r>
+          </w:p>
+          <w:p>
+            <w:pPr>
+              <w:spacing w:after="160"/>
+            </w:pPr>
+            <w:r>
+              <w:t>'Food supplies energy' and 'This person eats badly'. Which is a statement about a body job?</w:t>
+            </w:r>
+          </w:p>
+          <w:p>
+            <w:pPr>
+              <w:spacing w:after="160"/>
+            </w:pPr>
+            <w:r>
+              <w:rPr>
+                <w:i/>
+                <w:sz w:val="20"/>
+              </w:rPr>
+              <w:t>Keep the science about nutrients and evidence.</w:t>
+            </w:r>
+          </w:p>
+          <w:p>
+            <w:pPr>
+              <w:spacing w:after="160"/>
+            </w:pPr>
+            <w:r>
+              <w:br/>
+              <w:t>____________________________</w:t>
+              <w:br/>
+              <w:br/>
+              <w:t>____________________________</w:t>
+              <w:br/>
+            </w:r>
+          </w:p>
+        </w:tc>
+      </w:tr>
+      <w:tr>
+        <w:tc>
+          <w:tcPr>
+            <w:tcW w:type="dxa" w:w="5046"/>
+          </w:tcPr>
+          <w:p>
+            <w:pPr>
+              <w:spacing w:after="160"/>
+            </w:pPr>
+            <w:r>
+              <w:rPr>
+                <w:b/>
+              </w:rPr>
+              <w:t>3. Limit a judgement</w:t>
+            </w:r>
+          </w:p>
+          <w:p>
+            <w:pPr>
+              <w:spacing w:after="160"/>
+            </w:pPr>
+            <w:r>
+              <w:t>Can one food's sugar value describe a person's whole eating pattern? Explain.</w:t>
+            </w:r>
+          </w:p>
+          <w:p>
+            <w:pPr>
+              <w:spacing w:after="160"/>
+            </w:pPr>
+            <w:r>
+              <w:rPr>
+                <w:i/>
+                <w:sz w:val="20"/>
+              </w:rPr>
+              <w:t>Consider the other foods and information missing.</w:t>
+            </w:r>
+          </w:p>
+          <w:p>
+            <w:pPr>
+              <w:spacing w:after="160"/>
+            </w:pPr>
+            <w:r>
+              <w:br/>
+              <w:t>____________________________</w:t>
+              <w:br/>
+              <w:br/>
+              <w:t>____________________________</w:t>
+              <w:br/>
+            </w:r>
+          </w:p>
+        </w:tc>
+        <w:tc>
+          <w:tcPr>
+            <w:tcW w:type="dxa" w:w="5046"/>
+          </w:tcPr>
+          <w:p>
+            <w:pPr>
+              <w:spacing w:after="160"/>
+            </w:pPr>
+            <w:r>
+              <w:rPr>
+                <w:b/>
+              </w:rPr>
+              <w:t>4. Spot the mismatch</w:t>
+            </w:r>
+          </w:p>
+          <w:p>
+            <w:pPr>
+              <w:spacing w:after="160"/>
+            </w:pPr>
+            <w:r>
+              <w:t>Can 8 g sugar per serving be compared directly with 8 g per 100 g? What is missing?</w:t>
+            </w:r>
+          </w:p>
+          <w:p>
+            <w:pPr>
+              <w:spacing w:after="160"/>
+            </w:pPr>
+            <w:r>
+              <w:rPr>
+                <w:i/>
+                <w:sz w:val="20"/>
+              </w:rPr>
+              <w:t>A serving might not be 100 g.</w:t>
+            </w:r>
+          </w:p>
+          <w:p>
+            <w:pPr>
+              <w:spacing w:after="160"/>
+            </w:pPr>
+            <w:r>
+              <w:br/>
+              <w:t>____________________________</w:t>
+              <w:br/>
+              <w:br/>
+              <w:t>____________________________</w:t>
+              <w:br/>
+            </w:r>
+          </w:p>
+        </w:tc>
+      </w:tr>
+    </w:tbl>
     <w:p>
-      <w:pPr>
-        <w:pStyle w:val="Heading2"/>
-      </w:pPr>
       <w:r>
-        <w:t>Model helps us see</w:t>
-      </w:r>
-    </w:p>
-    <w:p>
-      <w:pPr/>
-      <w:r>
-        <w:t>The matched label cards remove serving-size differences so pupils can see a fair numerical comparison.</w:t>
-      </w:r>
-    </w:p>
-    <w:p>
-      <w:pPr>
-        <w:pStyle w:val="Heading2"/>
-      </w:pPr>
-      <w:r>
-        <w:t>Model does not show</w:t>
-      </w:r>
-    </w:p>
-    <w:p>
-      <w:pPr/>
-      <w:r>
-        <w:t>The simplified cards show sugar values only. They do not show portion eaten, frequency, other nutrients, allergies, medical needs or a whole dietary pattern.</w:t>
-      </w:r>
-    </w:p>
-    <w:p>
-      <w:pPr>
-        <w:pStyle w:val="Heading2"/>
-      </w:pPr>
-      <w:r>
-        <w:t>Supported</w:t>
-      </w:r>
-    </w:p>
-    <w:p>
-      <w:pPr/>
-      <w:r>
-        <w:t>Match four large number cards to a number line, then complete: __ g is least; __ g is most.</w:t>
-      </w:r>
-    </w:p>
-    <w:p>
-      <w:pPr/>
-      <w:r>
-        <w:t>Keep g and per 100 g printed beside every number. Offer two placements at a time and exact scribing.</w:t>
-      </w:r>
-    </w:p>
-    <w:p>
-      <w:pPr>
-        <w:pStyle w:val="Heading2"/>
-      </w:pPr>
-      <w:r>
-        <w:t>Standard</w:t>
-      </w:r>
-    </w:p>
-    <w:p>
-      <w:pPr/>
-      <w:r>
-        <w:t>Read the four sugar lines, build the table independently and explain one comparison using less/more and per 100 g.</w:t>
-      </w:r>
-    </w:p>
-    <w:p>
-      <w:pPr/>
-      <w:r>
-        <w:t>Use: Label __ has __ g per 100 g. This is less/more than __ because __.</w:t>
-      </w:r>
-    </w:p>
-    <w:p>
-      <w:pPr>
-        <w:pStyle w:val="Heading2"/>
-      </w:pPr>
-      <w:r>
-        <w:t>Stretch</w:t>
-      </w:r>
-    </w:p>
-    <w:p>
-      <w:pPr/>
-      <w:r>
-        <w:t>Audit a mixed-basis comparison, explain why it is invalid and state what extra information would be needed before a wider nutrition claim.</w:t>
-      </w:r>
-    </w:p>
-    <w:p>
-      <w:pPr/>
-      <w:r>
-        <w:t>Distinguish per serving from per 100 g and keep the conclusion within the available evidence.</w:t>
-      </w:r>
-    </w:p>
-    <w:p>
-      <w:pPr>
-        <w:pStyle w:val="Heading2"/>
-      </w:pPr>
-      <w:r>
-        <w:t>Evidence target</w:t>
-      </w:r>
-    </w:p>
-    <w:p>
-      <w:pPr/>
-      <w:r>
-        <w:t>Four sugar values in correct order with g per 100 g, one evidence sentence and one statement of what the comparison cannot show.</w:t>
-      </w:r>
-    </w:p>
-    <w:p>
-      <w:pPr>
-        <w:pStyle w:val="Heading2"/>
-      </w:pPr>
-      <w:r>
-        <w:t>Exit, Audience and evidence · W8A</w:t>
-      </w:r>
-    </w:p>
-    <w:p>
-      <w:pPr>
-        <w:keepNext/>
-      </w:pPr>
-      <w:r>
-        <w:t>Supported: Point and complete: __ g per 100 g is least; __ g per 100 g is most.</w:t>
-      </w:r>
-    </w:p>
-    <w:p>
-      <w:pPr>
-        <w:keepNext/>
-        <w:spacing w:after="0" w:line="240" w:lineRule="auto"/>
-        <w:pBdr>
-          <w:bottom w:val="single" w:sz="3" w:color="D6DFE4" w:space="1"/>
-        </w:pBdr>
-      </w:pPr>
-      <w:r>
-        <w:rPr>
-          <w:sz w:val="40"/>
-        </w:rPr>
-        <w:t xml:space="preserve"> </w:t>
-      </w:r>
-    </w:p>
-    <w:p>
-      <w:pPr>
-        <w:keepNext w:val="0"/>
-        <w:spacing w:after="0" w:line="240" w:lineRule="auto"/>
-        <w:pBdr>
-          <w:bottom w:val="single" w:sz="3" w:color="D6DFE4" w:space="1"/>
-        </w:pBdr>
-      </w:pPr>
-      <w:r>
-        <w:rPr>
-          <w:sz w:val="40"/>
-        </w:rPr>
-        <w:t xml:space="preserve"> </w:t>
-      </w:r>
-    </w:p>
-    <w:p>
-      <w:pPr/>
-      <w:r>
-        <w:t>Standard: Give one fair same-basis sugar comparison and state why sugar alone cannot describe the whole food.</w:t>
-      </w:r>
-    </w:p>
-    <w:p>
-      <w:pPr/>
-      <w:r>
-        <w:t>Stretch: Explain why mixed per-serving and per-100 g values cannot be ordered directly, then limit the conclusion.</w:t>
-      </w:r>
-    </w:p>
-    <w:p>
-      <w:pPr>
-        <w:pStyle w:val="Heading2"/>
-      </w:pPr>
-      <w:r>
-        <w:t>What I said, and what it changed</w:t>
-      </w:r>
-    </w:p>
-    <w:p>
-      <w:pPr/>
-      <w:r>
-        <w:t>________________________________________________</w:t>
-      </w:r>
-    </w:p>
-    <w:p>
-      <w:pPr>
-        <w:pStyle w:val="Heading2"/>
-      </w:pPr>
-      <w:r>
-        <w:t>Next I will ______.</w:t>
-      </w:r>
-    </w:p>
-    <w:p>
-      <w:pPr>
-        <w:pStyle w:val="Heading2"/>
-      </w:pPr>
-      <w:r>
-        <w:t>Adult witness note</w:t>
-      </w:r>
-    </w:p>
-    <w:p>
-      <w:pPr/>
-      <w:r>
-        <w:t>What was observed, and with what level of independence?</w:t>
-      </w:r>
-    </w:p>
-    <w:p>
-      <w:pPr>
-        <w:pStyle w:val="Heading2"/>
-        <w:keepNext/>
-      </w:pPr>
-      <w:r>
-        <w:t>My evidence and explanation</w:t>
-      </w:r>
-    </w:p>
-    <w:p>
-      <w:pPr>
-        <w:keepNext/>
-        <w:spacing w:after="0" w:line="240" w:lineRule="auto"/>
-        <w:pBdr>
-          <w:bottom w:val="single" w:sz="3" w:color="D6DFE4" w:space="1"/>
-        </w:pBdr>
-      </w:pPr>
-      <w:r>
-        <w:rPr>
-          <w:sz w:val="40"/>
-        </w:rPr>
-        <w:t xml:space="preserve"> </w:t>
-      </w:r>
-    </w:p>
-    <w:p>
-      <w:pPr>
-        <w:keepNext/>
-        <w:spacing w:after="0" w:line="240" w:lineRule="auto"/>
-        <w:pBdr>
-          <w:bottom w:val="single" w:sz="3" w:color="D6DFE4" w:space="1"/>
-        </w:pBdr>
-      </w:pPr>
-      <w:r>
-        <w:rPr>
-          <w:sz w:val="40"/>
-        </w:rPr>
-        <w:t xml:space="preserve"> </w:t>
-      </w:r>
-    </w:p>
-    <w:p>
-      <w:pPr>
-        <w:keepNext/>
-        <w:spacing w:after="0" w:line="240" w:lineRule="auto"/>
-        <w:pBdr>
-          <w:bottom w:val="single" w:sz="3" w:color="D6DFE4" w:space="1"/>
-        </w:pBdr>
-      </w:pPr>
-      <w:r>
-        <w:rPr>
-          <w:sz w:val="40"/>
-        </w:rPr>
-        <w:t xml:space="preserve"> </w:t>
-      </w:r>
-    </w:p>
-    <w:p>
-      <w:pPr>
-        <w:keepNext/>
-        <w:spacing w:after="0" w:line="240" w:lineRule="auto"/>
-        <w:pBdr>
-          <w:bottom w:val="single" w:sz="3" w:color="D6DFE4" w:space="1"/>
-        </w:pBdr>
-      </w:pPr>
-      <w:r>
-        <w:rPr>
-          <w:sz w:val="40"/>
-        </w:rPr>
-        <w:t xml:space="preserve"> </w:t>
-      </w:r>
-    </w:p>
-    <w:p>
-      <w:pPr>
-        <w:keepNext w:val="0"/>
-        <w:spacing w:after="0" w:line="240" w:lineRule="auto"/>
-        <w:pBdr>
-          <w:bottom w:val="single" w:sz="3" w:color="D6DFE4" w:space="1"/>
-        </w:pBdr>
-      </w:pPr>
-      <w:r>
-        <w:rPr>
-          <w:sz w:val="40"/>
-        </w:rPr>
-        <w:t xml:space="preserve"> </w:t>
-      </w:r>
-    </w:p>
-    <w:p>
-      <w:pPr>
-        <w:keepNext/>
-      </w:pPr>
-      <w:r>
-        <w:t>What does this evidence not show?</w:t>
-      </w:r>
-    </w:p>
-    <w:p>
-      <w:pPr>
-        <w:keepNext/>
-        <w:spacing w:after="0" w:line="240" w:lineRule="auto"/>
-        <w:pBdr>
-          <w:bottom w:val="single" w:sz="3" w:color="D6DFE4" w:space="1"/>
-        </w:pBdr>
-      </w:pPr>
-      <w:r>
-        <w:rPr>
-          <w:sz w:val="40"/>
-        </w:rPr>
-        <w:t xml:space="preserve"> </w:t>
-      </w:r>
-    </w:p>
-    <w:p>
-      <w:pPr>
-        <w:keepNext w:val="0"/>
-        <w:spacing w:after="0" w:line="240" w:lineRule="auto"/>
-        <w:pBdr>
-          <w:bottom w:val="single" w:sz="3" w:color="D6DFE4" w:space="1"/>
-        </w:pBdr>
-      </w:pPr>
-      <w:r>
-        <w:rPr>
-          <w:sz w:val="40"/>
-        </w:rPr>
-        <w:t xml:space="preserve"> </w:t>
+        <w:br w:type="page"/>
       </w:r>
     </w:p>
     <w:p>
       <w:pPr>
         <w:pStyle w:val="Heading1"/>
-        <w:pageBreakBefore/>
       </w:pPr>
       <w:r>
-        <w:t>Visual reference cards</w:t>
+        <w:t>Your task Stretch</w:t>
       </w:r>
     </w:p>
     <w:p>
       <w:r>
-        <w:t>These are diagrams or model views from the uploaded lesson. Use their labels and the card descriptions; they are not photographs of your own results.</w:t>
+        <w:rPr>
+          <w:b w:val="0"/>
+        </w:rPr>
+        <w:t>Use the shared label cards. Choose a book, this paper or a spoken response. You only need to answer once.</w:t>
+      </w:r>
+    </w:p>
+    <w:p>
+      <w:r>
+        <w:rPr>
+          <w:b/>
+        </w:rPr>
+        <w:t>1. Fictional labels, all PER 100 g: A - carbohydrate 22 g, sugars 4 g; B - carbohydrate 67 g, sugars 9 g; C - carbohydrate 58 g, sugars 14 g; D - carbohydrate 72 g, sugars 23 g.</w:t>
+      </w:r>
+    </w:p>
+    <w:p>
+      <w:r>
+        <w:rPr>
+          <w:b w:val="0"/>
+        </w:rPr>
+        <w:t>Help if useful: Identify the nutrient and reference amount before selecting numerical evidence.</w:t>
+      </w:r>
+    </w:p>
+    <w:p>
+      <w:r>
+        <w:rPr>
+          <w:b w:val="0"/>
+        </w:rPr>
+        <w:t>___________________________________________________________________</w:t>
+      </w:r>
+    </w:p>
+    <w:p>
+      <w:r>
+        <w:rPr>
+          <w:b w:val="0"/>
+        </w:rPr>
+        <w:t>___________________________________________________________________</w:t>
+      </w:r>
+    </w:p>
+    <w:p>
+      <w:r>
+        <w:rPr>
+          <w:b/>
+        </w:rPr>
+        <w:t>2. Extract the four sugar values and order them. Keep the unit and basis.</w:t>
+      </w:r>
+    </w:p>
+    <w:p>
+      <w:r>
+        <w:rPr>
+          <w:b w:val="0"/>
+        </w:rPr>
+        <w:t>Help if useful: Audit the completed order against the source labels; a correct number copied from the wrong row is still the wrong evidence.</w:t>
+      </w:r>
+    </w:p>
+    <w:p>
+      <w:r>
+        <w:rPr>
+          <w:b w:val="0"/>
+        </w:rPr>
+        <w:t>___________________________________________________________________</w:t>
+      </w:r>
+    </w:p>
+    <w:p>
+      <w:r>
+        <w:rPr>
+          <w:b w:val="0"/>
+        </w:rPr>
+        <w:t>___________________________________________________________________</w:t>
+      </w:r>
+    </w:p>
+    <w:p>
+      <w:r>
+        <w:rPr>
+          <w:b/>
+        </w:rPr>
+        <w:t>3. Extra label E says 'sugars 3 g per 25 g serving'. Someone puts E before A because 3 is less than 4. Audit this decision.</w:t>
+      </w:r>
+    </w:p>
+    <w:p>
+      <w:r>
+        <w:rPr>
+          <w:b w:val="0"/>
+        </w:rPr>
+        <w:t>Help if useful: Compare the reference quantities before comparing the two bare numbers.</w:t>
+      </w:r>
+    </w:p>
+    <w:p>
+      <w:r>
+        <w:rPr>
+          <w:b w:val="0"/>
+        </w:rPr>
+        <w:t>___________________________________________________________________</w:t>
+      </w:r>
+    </w:p>
+    <w:p>
+      <w:r>
+        <w:rPr>
+          <w:b w:val="0"/>
+        </w:rPr>
+        <w:t>___________________________________________________________________</w:t>
+      </w:r>
+    </w:p>
+    <w:p>
+      <w:r>
+        <w:br w:type="page"/>
       </w:r>
     </w:p>
     <w:p>
       <w:pPr>
-        <w:keepNext/>
-        <w:jc w:val="center"/>
+        <w:pStyle w:val="Heading1"/>
       </w:pPr>
       <w:r>
-        <w:drawing>
-          <wp:inline xmlns:a="http://schemas.openxmlformats.org/drawingml/2006/main" xmlns:pic="http://schemas.openxmlformats.org/drawingml/2006/picture">
-            <wp:extent cx="2438400" cy="2194560"/>
-            <wp:docPr id="2" name="Picture 2"/>
-            <wp:cNvGraphicFramePr>
-              <a:graphicFrameLocks noChangeAspect="1"/>
-            </wp:cNvGraphicFramePr>
-            <a:graphic>
-              <a:graphicData uri="http://schemas.openxmlformats.org/drawingml/2006/picture">
-                <pic:pic>
-                  <pic:nvPicPr>
-                    <pic:cNvPr id="0" name="2f62de4c6db2bb77f51b.png"/>
-                    <pic:cNvPicPr/>
-                  </pic:nvPicPr>
-                  <pic:blipFill>
-                    <a:blip r:embed="rId12"/>
-                    <a:stretch>
-                      <a:fillRect/>
-                    </a:stretch>
-                  </pic:blipFill>
-                  <pic:spPr>
-                    <a:xfrm>
-                      <a:off x="0" y="0"/>
-                      <a:ext cx="2438400" cy="2194560"/>
-                    </a:xfrm>
-                    <a:prstGeom prst="rect"/>
-                  </pic:spPr>
-                </pic:pic>
-              </a:graphicData>
-            </a:graphic>
-          </wp:inline>
-        </w:drawing>
+        <w:t>Your task Stretch continued</w:t>
+      </w:r>
+    </w:p>
+    <w:p>
+      <w:r>
+        <w:rPr>
+          <w:b w:val="0"/>
+        </w:rPr>
+        <w:t>Use the shared label cards. Choose a book, this paper or a spoken response. You only need to answer once.</w:t>
+      </w:r>
+    </w:p>
+    <w:p>
+      <w:r>
+        <w:rPr>
+          <w:b/>
+        </w:rPr>
+        <w:t>4. Put E on a per-100 g basis before comparing. How many 25 g servings make 100 g? Then place E among A-D.</w:t>
+      </w:r>
+    </w:p>
+    <w:p>
+      <w:r>
+        <w:rPr>
+          <w:b w:val="0"/>
+        </w:rPr>
+        <w:t>Help if useful: Find the scale factor from 25 g of food to 100 g of food. Apply the same factor to the sugar amount.</w:t>
+      </w:r>
+    </w:p>
+    <w:p>
+      <w:r>
+        <w:rPr>
+          <w:b w:val="0"/>
+        </w:rPr>
+        <w:t>___________________________________________________________________</w:t>
+      </w:r>
+    </w:p>
+    <w:p>
+      <w:r>
+        <w:rPr>
+          <w:b w:val="0"/>
+        </w:rPr>
+        <w:t>___________________________________________________________________</w:t>
+      </w:r>
+    </w:p>
+    <w:p>
+      <w:r>
+        <w:rPr>
+          <w:b w:val="0"/>
+        </w:rPr>
+        <w:t>___________________________________________________________________</w:t>
+      </w:r>
+    </w:p>
+    <w:p>
+      <w:r>
+        <w:rPr>
+          <w:b/>
+        </w:rPr>
+        <w:t>5. Write one supported comparison from A-D and repair this claim: 'The lowest-sugar card proves the best food for everybody.'</w:t>
+      </w:r>
+    </w:p>
+    <w:p>
+      <w:r>
+        <w:rPr>
+          <w:b w:val="0"/>
+        </w:rPr>
+        <w:t>Help if useful: Separate a justified numerical comparison from a wider judgement. State exactly what the evidence establishes and what it leaves unknown.</w:t>
+      </w:r>
+    </w:p>
+    <w:p>
+      <w:r>
+        <w:rPr>
+          <w:b w:val="0"/>
+        </w:rPr>
+        <w:t>___________________________________________________________________</w:t>
+      </w:r>
+    </w:p>
+    <w:p>
+      <w:r>
+        <w:rPr>
+          <w:b w:val="0"/>
+        </w:rPr>
+        <w:t>___________________________________________________________________</w:t>
+      </w:r>
+    </w:p>
+    <w:p>
+      <w:r>
+        <w:rPr>
+          <w:b w:val="0"/>
+        </w:rPr>
+        <w:t>___________________________________________________________________</w:t>
+      </w:r>
+    </w:p>
+    <w:p>
+      <w:r>
+        <w:br w:type="page"/>
       </w:r>
     </w:p>
     <w:p>
       <w:pPr>
-        <w:pStyle w:val="Caption"/>
-        <w:keepNext w:val="0"/>
+        <w:pStyle w:val="Heading1"/>
       </w:pPr>
       <w:r>
-        <w:t>Nutrition label B with the of-which-sugars line highlighted: 9 g per 100 g</w:t>
+        <w:t>Exit ticket Stretch</w:t>
       </w:r>
     </w:p>
     <w:p>
-      <w:pPr>
-        <w:keepNext/>
-        <w:jc w:val="center"/>
-      </w:pPr>
       <w:r>
-        <w:drawing>
-          <wp:inline xmlns:a="http://schemas.openxmlformats.org/drawingml/2006/main" xmlns:pic="http://schemas.openxmlformats.org/drawingml/2006/picture">
-            <wp:extent cx="6080760" cy="2104878"/>
-            <wp:docPr id="3" name="Picture 3"/>
-            <wp:cNvGraphicFramePr>
-              <a:graphicFrameLocks noChangeAspect="1"/>
-            </wp:cNvGraphicFramePr>
-            <a:graphic>
-              <a:graphicData uri="http://schemas.openxmlformats.org/drawingml/2006/picture">
-                <pic:pic>
-                  <pic:nvPicPr>
-                    <pic:cNvPr id="0" name="a056d95cd1521d9114c0.png"/>
-                    <pic:cNvPicPr/>
-                  </pic:nvPicPr>
-                  <pic:blipFill>
-                    <a:blip r:embed="rId13"/>
-                    <a:stretch>
-                      <a:fillRect/>
-                    </a:stretch>
-                  </pic:blipFill>
-                  <pic:spPr>
-                    <a:xfrm>
-                      <a:off x="0" y="0"/>
-                      <a:ext cx="6080760" cy="2104878"/>
-                    </a:xfrm>
-                    <a:prstGeom prst="rect"/>
-                  </pic:spPr>
-                </pic:pic>
-              </a:graphicData>
-            </a:graphic>
-          </wp:inline>
-        </w:drawing>
+        <w:rPr>
+          <w:b w:val="0"/>
+        </w:rPr>
+        <w:t>Name ____________________</w:t>
+        <w:br/>
+        <w:t>Point, circle, say or write. An adult can scribe. Choose this ticket or the screen or your book.</w:t>
       </w:r>
     </w:p>
     <w:p>
-      <w:pPr>
-        <w:pStyle w:val="Caption"/>
-        <w:keepNext w:val="0"/>
-      </w:pPr>
       <w:r>
-        <w:t>Six grams beside nine grams, both per 100 g, with a question mark</w:t>
+        <w:rPr>
+          <w:b/>
+        </w:rPr>
+        <w:t>1. Put E on the same basis.</w:t>
       </w:r>
     </w:p>
     <w:p>
-      <w:pPr>
-        <w:keepNext/>
-        <w:jc w:val="center"/>
-      </w:pPr>
       <w:r>
-        <w:drawing>
-          <wp:inline xmlns:a="http://schemas.openxmlformats.org/drawingml/2006/main" xmlns:pic="http://schemas.openxmlformats.org/drawingml/2006/picture">
-            <wp:extent cx="2438400" cy="2194560"/>
-            <wp:docPr id="4" name="Picture 4"/>
-            <wp:cNvGraphicFramePr>
-              <a:graphicFrameLocks noChangeAspect="1"/>
-            </wp:cNvGraphicFramePr>
-            <a:graphic>
-              <a:graphicData uri="http://schemas.openxmlformats.org/drawingml/2006/picture">
-                <pic:pic>
-                  <pic:nvPicPr>
-                    <pic:cNvPr id="0" name="be16e05eb7da2e51b5e8.png"/>
-                    <pic:cNvPicPr/>
-                  </pic:nvPicPr>
-                  <pic:blipFill>
-                    <a:blip r:embed="rId14"/>
-                    <a:stretch>
-                      <a:fillRect/>
-                    </a:stretch>
-                  </pic:blipFill>
-                  <pic:spPr>
-                    <a:xfrm>
-                      <a:off x="0" y="0"/>
-                      <a:ext cx="2438400" cy="2194560"/>
-                    </a:xfrm>
-                    <a:prstGeom prst="rect"/>
-                  </pic:spPr>
-                </pic:pic>
-              </a:graphicData>
-            </a:graphic>
-          </wp:inline>
-        </w:drawing>
+        <w:rPr>
+          <w:b w:val="0"/>
+        </w:rPr>
+        <w:t>Label E: 3 g sugars per 25 g serving. Four servings make 100 g: 3 + 3 + 3 + 3.</w:t>
       </w:r>
     </w:p>
     <w:p>
-      <w:pPr>
-        <w:pStyle w:val="Caption"/>
-        <w:keepNext w:val="0"/>
-      </w:pPr>
       <w:r>
-        <w:t>Tappable nutrition label 1</w:t>
+        <w:rPr>
+          <w:b w:val="0"/>
+        </w:rPr>
+        <w:t>E has  6 g / 12 g / 24 g  sugars per 100 g.</w:t>
       </w:r>
     </w:p>
     <w:p>
-      <w:pPr>
-        <w:keepNext/>
-        <w:jc w:val="center"/>
-      </w:pPr>
       <w:r>
-        <w:drawing>
-          <wp:inline xmlns:a="http://schemas.openxmlformats.org/drawingml/2006/main" xmlns:pic="http://schemas.openxmlformats.org/drawingml/2006/picture">
-            <wp:extent cx="2438400" cy="2194560"/>
-            <wp:docPr id="5" name="Picture 5"/>
-            <wp:cNvGraphicFramePr>
-              <a:graphicFrameLocks noChangeAspect="1"/>
-            </wp:cNvGraphicFramePr>
-            <a:graphic>
-              <a:graphicData uri="http://schemas.openxmlformats.org/drawingml/2006/picture">
-                <pic:pic>
-                  <pic:nvPicPr>
-                    <pic:cNvPr id="0" name="aa9fed183669e966da12.png"/>
-                    <pic:cNvPicPr/>
-                  </pic:nvPicPr>
-                  <pic:blipFill>
-                    <a:blip r:embed="rId15"/>
-                    <a:stretch>
-                      <a:fillRect/>
-                    </a:stretch>
-                  </pic:blipFill>
-                  <pic:spPr>
-                    <a:xfrm>
-                      <a:off x="0" y="0"/>
-                      <a:ext cx="2438400" cy="2194560"/>
-                    </a:xfrm>
-                    <a:prstGeom prst="rect"/>
-                  </pic:spPr>
-                </pic:pic>
-              </a:graphicData>
-            </a:graphic>
-          </wp:inline>
-        </w:drawing>
+        <w:rPr>
+          <w:b w:val="0"/>
+        </w:rPr>
+        <w:t>Compared with B (9 g), E has  less sugar / more sugar.</w:t>
       </w:r>
     </w:p>
     <w:p>
-      <w:pPr>
-        <w:pStyle w:val="Caption"/>
-        <w:keepNext w:val="0"/>
-      </w:pPr>
       <w:r>
-        <w:t>Tappable nutrition label 2</w:t>
+        <w:rPr>
+          <w:b/>
+        </w:rPr>
+        <w:t>2. What else would you need to know about the food?</w:t>
       </w:r>
     </w:p>
     <w:p>
-      <w:pPr>
-        <w:pStyle w:val="Heading2"/>
-      </w:pPr>
       <w:r>
-        <w:t>Exit · one next step</w:t>
+        <w:rPr>
+          <w:b w:val="0"/>
+        </w:rPr>
+        <w:t>Other nutrient amounts       /       The label font</w:t>
       </w:r>
     </w:p>
     <w:p>
-      <w:pPr>
-        <w:keepNext/>
-      </w:pPr>
       <w:r>
-        <w:t>After the adult has listened, what will you keep, improve or check next?</w:t>
+        <w:rPr>
+          <w:b w:val="0"/>
+        </w:rPr>
+        <w:t>Or say or write your own example:</w:t>
       </w:r>
     </w:p>
     <w:p>
-      <w:pPr>
-        <w:keepNext/>
-        <w:spacing w:after="0" w:line="240" w:lineRule="auto"/>
-        <w:pBdr>
-          <w:bottom w:val="single" w:sz="3" w:color="D6DFE4" w:space="1"/>
-        </w:pBdr>
-      </w:pPr>
       <w:r>
         <w:rPr>
-          <w:sz w:val="40"/>
+          <w:b w:val="0"/>
         </w:rPr>
-        <w:t xml:space="preserve"> </w:t>
+        <w:t>___________________________________________________________________</w:t>
       </w:r>
     </w:p>
     <w:p>
-      <w:pPr>
-        <w:keepNext w:val="0"/>
-        <w:spacing w:after="0" w:line="240" w:lineRule="auto"/>
-        <w:pBdr>
-          <w:bottom w:val="single" w:sz="3" w:color="D6DFE4" w:space="1"/>
-        </w:pBdr>
-      </w:pPr>
       <w:r>
         <w:rPr>
-          <w:sz w:val="40"/>
+          <w:b w:val="0"/>
         </w:rPr>
-        <w:t xml:space="preserve"> </w:t>
+        <w:t>___________________________________________________________________</w:t>
+      </w:r>
+    </w:p>
+    <w:p>
+      <w:r>
+        <w:rPr>
+          <w:b w:val="0"/>
+        </w:rPr>
+        <w:t>Next lesson: Body Science Checkpoint</w:t>
       </w:r>
     </w:p>
     <w:sectPr>
       <w:headerReference w:type="default" r:id="rId9"/>
       <w:footerReference w:type="default" r:id="rId10"/>
       <w:pgSz w:w="11906" w:h="16838"/>
-      <w:pgMar w:top="1020" w:right="1020" w:bottom="1020" w:left="1020" w:header="397" w:footer="397" w:gutter="0"/>
+      <w:pgMar w:top="907" w:right="907" w:bottom="907" w:left="907" w:header="720" w:footer="720" w:gutter="0"/>
       <w:cols w:space="720"/>
       <w:docGrid w:linePitch="360"/>
     </w:sectPr>
@@ -1820,10 +2783,9 @@
     </w:pPr>
     <w:r>
       <w:rPr>
-        <w:rFonts w:ascii="Arial" w:hAnsi="Arial"/>
-        <w:sz w:val="16"/>
-      </w:rPr>
-      <w:t xml:space="preserve">W8A  •  </w:t>
+        <w:sz w:val="18"/>
+      </w:rPr>
+      <w:t xml:space="preserve">Pupil pack   |   </w:t>
     </w:r>
     <w:fldSimple w:instr="PAGE"/>
   </w:p>
@@ -1834,15 +2796,13 @@
 <w:hdr xmlns:m="http://schemas.openxmlformats.org/officeDocument/2006/math" xmlns:mc="http://schemas.openxmlformats.org/markup-compatibility/2006" xmlns:mo="http://schemas.microsoft.com/office/mac/office/2008/main" xmlns:mv="urn:schemas-microsoft-com:mac:vml" xmlns:o="urn:schemas-microsoft-com:office:office" xmlns:r="http://schemas.openxmlformats.org/officeDocument/2006/relationships" xmlns:v="urn:schemas-microsoft-com:vml" xmlns:w10="urn:schemas-microsoft-com:office:word" xmlns:w14="http://schemas.microsoft.com/office/word/2010/wordml" xmlns:w="http://schemas.openxmlformats.org/wordprocessingml/2006/main" xmlns:wne="http://schemas.microsoft.com/office/word/2006/wordml" xmlns:wp14="http://schemas.microsoft.com/office/word/2010/wordprocessingDrawing" xmlns:wp="http://schemas.openxmlformats.org/drawingml/2006/wordprocessingDrawing" xmlns:wpc="http://schemas.microsoft.com/office/word/2010/wordprocessingCanvas" xmlns:wpg="http://schemas.microsoft.com/office/word/2010/wordprocessingGroup" xmlns:wpi="http://schemas.microsoft.com/office/word/2010/wordprocessingInk" xmlns:wps="http://schemas.microsoft.com/office/word/2010/wordprocessingShape" mc:Ignorable="w14 wp14">
   <w:p>
     <w:pPr>
-      <w:pStyle w:val="Caption"/>
+      <w:pStyle w:val="Header"/>
     </w:pPr>
     <w:r>
       <w:rPr>
-        <w:rFonts w:ascii="Arial" w:hAnsi="Arial"/>
-        <w:color w:val="4E7A9B"/>
         <w:sz w:val="18"/>
       </w:rPr>
-      <w:t>BUILD  /  SCIENCE    •    PUPIL PACK</w:t>
+      <w:t>MADE BY MATT    BUILD SCIENCE    W8A</w:t>
     </w:r>
   </w:p>
 </w:hdr>
@@ -2212,12 +3172,13 @@
     <w:qFormat/>
     <w:rsid w:val="00FC693F"/>
     <w:pPr>
-      <w:spacing w:after="120" w:line="276" w:lineRule="auto"/>
+      <w:widowControl/>
+      <w:spacing w:after="140" w:line="271" w:lineRule="auto"/>
     </w:pPr>
     <w:rPr>
       <w:rFonts w:ascii="Arial" w:hAnsi="Arial"/>
-      <w:color w:val="18233F"/>
-      <w:sz w:val="24"/>
+      <w:color w:val="000000"/>
+      <w:sz w:val="26"/>
     </w:rPr>
   </w:style>
   <w:style w:type="paragraph" w:styleId="Header">
@@ -2275,15 +3236,15 @@
     <w:pPr>
       <w:keepNext/>
       <w:keepLines/>
-      <w:spacing w:before="280" w:after="160"/>
+      <w:spacing w:before="480" w:after="140" w:line="271" w:lineRule="auto"/>
       <w:outlineLvl w:val="0"/>
     </w:pPr>
     <w:rPr>
       <w:rFonts w:asciiTheme="majorHAnsi" w:eastAsiaTheme="majorEastAsia" w:hAnsiTheme="majorHAnsi" w:cstheme="majorBidi" w:ascii="Arial" w:hAnsi="Arial"/>
       <w:b/>
       <w:bCs/>
-      <w:color w:val="4E7A9B"/>
-      <w:sz w:val="32"/>
+      <w:color w:val="000000"/>
+      <w:sz w:val="40"/>
       <w:szCs w:val="28"/>
     </w:rPr>
   </w:style>
@@ -2299,15 +3260,15 @@
     <w:pPr>
       <w:keepNext/>
       <w:keepLines/>
-      <w:spacing w:before="200" w:after="120"/>
+      <w:spacing w:before="200" w:after="140" w:line="271" w:lineRule="auto"/>
       <w:outlineLvl w:val="1"/>
     </w:pPr>
     <w:rPr>
       <w:rFonts w:asciiTheme="majorHAnsi" w:eastAsiaTheme="majorEastAsia" w:hAnsiTheme="majorHAnsi" w:cstheme="majorBidi" w:ascii="Arial" w:hAnsi="Arial"/>
       <w:b/>
       <w:bCs/>
-      <w:color w:val="4E7A9B"/>
-      <w:sz w:val="26"/>
+      <w:color w:val="000000"/>
+      <w:sz w:val="28"/>
       <w:szCs w:val="26"/>
     </w:rPr>
   </w:style>
@@ -2323,14 +3284,14 @@
     <w:pPr>
       <w:keepNext/>
       <w:keepLines/>
-      <w:spacing w:before="160" w:after="100"/>
+      <w:spacing w:before="200" w:after="140" w:line="271" w:lineRule="auto"/>
       <w:outlineLvl w:val="2"/>
     </w:pPr>
     <w:rPr>
       <w:rFonts w:asciiTheme="majorHAnsi" w:eastAsiaTheme="majorEastAsia" w:hAnsiTheme="majorHAnsi" w:cstheme="majorBidi" w:ascii="Arial" w:hAnsi="Arial"/>
       <w:b/>
       <w:bCs/>
-      <w:color w:val="4E7A9B"/>
+      <w:color w:val="000000"/>
       <w:sz w:val="24"/>
     </w:rPr>
   </w:style>
@@ -2562,20 +3523,15 @@
     <w:qFormat/>
     <w:rsid w:val="00FC693F"/>
     <w:pPr>
-      <w:keepNext/>
-      <w:pBdr>
-        <w:bottom w:val="single" w:sz="8" w:space="4" w:color="4F81BD" w:themeColor="accent1"/>
-      </w:pBdr>
-      <w:spacing w:after="200" w:line="240" w:lineRule="auto" w:before="0"/>
+      <w:spacing w:after="140" w:line="271" w:lineRule="auto"/>
       <w:contextualSpacing/>
     </w:pPr>
     <w:rPr>
       <w:rFonts w:asciiTheme="majorHAnsi" w:eastAsiaTheme="majorEastAsia" w:hAnsiTheme="majorHAnsi" w:cstheme="majorBidi" w:ascii="Arial" w:hAnsi="Arial"/>
-      <w:b/>
-      <w:color w:val="4E7A9B"/>
+      <w:color w:val="000000"/>
       <w:spacing w:val="5"/>
       <w:kern w:val="28"/>
-      <w:sz w:val="44"/>
+      <w:sz w:val="46"/>
       <w:szCs w:val="52"/>
     </w:rPr>
   </w:style>
@@ -2652,13 +3608,8 @@
     <w:unhideWhenUsed/>
     <w:rsid w:val="00AA1D8D"/>
     <w:pPr>
-      <w:spacing w:after="120" w:line="276" w:lineRule="auto"/>
+      <w:spacing w:after="120"/>
     </w:pPr>
-    <w:rPr>
-      <w:rFonts w:ascii="Arial" w:hAnsi="Arial"/>
-      <w:color w:val="18233F"/>
-      <w:sz w:val="24"/>
-    </w:rPr>
   </w:style>
   <w:style w:type="character" w:customStyle="1" w:styleId="BodyTextChar">
     <w:name w:val="Body Text Char"/>
@@ -2754,15 +3705,8 @@
       <w:numPr>
         <w:numId w:val="1"/>
       </w:numPr>
-      <w:spacing w:after="120" w:line="276" w:lineRule="auto"/>
-      <w:ind w:left="340" w:hanging="170"/>
       <w:contextualSpacing/>
     </w:pPr>
-    <w:rPr>
-      <w:rFonts w:ascii="Arial" w:hAnsi="Arial"/>
-      <w:color w:val="18233F"/>
-      <w:sz w:val="24"/>
-    </w:rPr>
   </w:style>
   <w:style w:type="paragraph" w:styleId="ListBullet2">
     <w:name w:val="List Bullet 2"/>
@@ -2800,15 +3744,8 @@
       <w:numPr>
         <w:numId w:val="5"/>
       </w:numPr>
-      <w:spacing w:after="120" w:line="276" w:lineRule="auto"/>
-      <w:ind w:left="340" w:hanging="170"/>
       <w:contextualSpacing/>
     </w:pPr>
-    <w:rPr>
-      <w:rFonts w:ascii="Arial" w:hAnsi="Arial"/>
-      <w:color w:val="18233F"/>
-      <w:sz w:val="24"/>
-    </w:rPr>
   </w:style>
   <w:style w:type="paragraph" w:styleId="ListNumber2">
     <w:name w:val="List Number 2"/>
@@ -3070,9 +4007,6 @@
     <w:qFormat/>
     <w:rsid w:val="00FC693F"/>
     <w:pPr>
-      <w:pBdr>
-        <w:bottom w:val="single" w:sz="4" w:space="4" w:color="4F81BD" w:themeColor="accent1"/>
-      </w:pBdr>
       <w:spacing w:before="200" w:after="280"/>
       <w:ind w:left="936" w:right="936"/>
     </w:pPr>

</xml_diff>